<commit_message>
Eliminar archivos .pth grandes y exportar
</commit_message>
<xml_diff>
--- a/outputs/Actividad_CNN_Emociones_Risco_Gil_Manuel_Fabrizzio.docx
+++ b/outputs/Actividad_CNN_Emociones_Risco_Gil_Manuel_Fabrizzio.docx
@@ -13,9 +13,9 @@
           <w:rFonts w:ascii="Calibri" w:hAnsi="Calibri"/>
           <w:b/>
           <w:color w:val="003366"/>
-          <w:sz w:val="34"/>
+          <w:sz w:val="32"/>
         </w:rPr>
-        <w:t>UNIVERSIDAD NACIONAL / PRIVADA</w:t>
+        <w:t>UNIVERSIDAD TECNOLÓGICA DEL PERÚ / FACULTAD DE INGENIERÍA</w:t>
       </w:r>
     </w:p>
     <w:p>
@@ -27,11 +27,9 @@
           <w:rFonts w:ascii="Calibri" w:hAnsi="Calibri"/>
           <w:b/>
           <w:color w:val="004C99"/>
-          <w:sz w:val="26"/>
+          <w:sz w:val="25"/>
         </w:rPr>
-        <w:t>FACULTAD DE INGENIERÍA</w:t>
-        <w:br/>
-        <w:t>ESCUELA PROFESIONAL DE INGENIERÍA DE SISTEMAS COMPUTACIONALES</w:t>
+        <w:t>ESCUELA PROFESIONAL DE INGENIERÍA DE SISTEMAS E INFORMÁTICA</w:t>
       </w:r>
     </w:p>
     <w:p/>
@@ -43,7 +41,7 @@
         <w:rPr>
           <w:color w:val="0066CC"/>
         </w:rPr>
-        <w:t>━━━━━━━━━━━━━━━━━━━━━━━━━━━━━━━━━━━━━━━━━━━━━━━━━━━━━━━</w:t>
+        <w:t>━━━━━━━━━━━━━━━━━━━━━━━━━━━━━━━━━━━━━━━━━━━━━━━━━━━━━━━━━━</w:t>
       </w:r>
     </w:p>
     <w:p>
@@ -55,13 +53,13 @@
           <w:rFonts w:ascii="Calibri" w:hAnsi="Calibri"/>
           <w:b/>
           <w:color w:val="003366"/>
-          <w:sz w:val="32"/>
+          <w:sz w:val="31"/>
         </w:rPr>
         <w:t>RECONOCIMIENTO AUTOMÁTICO DE EMOCIONES FACIALES</w:t>
         <w:br/>
-        <w:t>MEDIANTE REDES NEURONALES CONVOLUCIONALES (CNN)</w:t>
+        <w:t>MEDIANTE REDES NEURONALES RESIDUALES CON ATENCIÓN (SE-ResNet)</w:t>
         <w:br/>
-        <w:t>CON ACELERACIÓN GPU CUDA</w:t>
+        <w:t>DETECTOR YuNet, ACELERACIÓN VRAM Y DESPLIEGUE PORTÁTIL ONNX</w:t>
       </w:r>
     </w:p>
     <w:p>
@@ -72,7 +70,7 @@
         <w:rPr>
           <w:color w:val="0066CC"/>
         </w:rPr>
-        <w:t>━━━━━━━━━━━━━━━━━━━━━━━━━━━━━━━━━━━━━━━━━━━━━━━━━━━━━━━</w:t>
+        <w:t>━━━━━━━━━━━━━━━━━━━━━━━━━━━━━━━━━━━━━━━━━━━━━━━━━━━━━━━━━━</w:t>
       </w:r>
     </w:p>
     <w:p/>
@@ -87,10 +85,9 @@
           <w:color w:val="646464"/>
           <w:sz w:val="22"/>
         </w:rPr>
-        <w:t>INFORME DE LABORATORIO / PROYECTO TÉCNICO - SEMANA 1</w:t>
+        <w:t>INFORME DE PROYECTO ACADÉMICO - SISTEMAS INTELIGENTES</w:t>
       </w:r>
     </w:p>
-    <w:p/>
     <w:p/>
     <w:tbl>
       <w:tblPr>
@@ -116,7 +113,7 @@
                 <w:rFonts w:ascii="Calibri" w:hAnsi="Calibri"/>
                 <w:b/>
                 <w:color w:val="003366"/>
-                <w:sz w:val="22"/>
+                <w:sz w:val="21"/>
               </w:rPr>
               <w:t>Curso:</w:t>
             </w:r>
@@ -134,7 +131,7 @@
               <w:rPr>
                 <w:rFonts w:ascii="Calibri" w:hAnsi="Calibri"/>
                 <w:color w:val="282828"/>
-                <w:sz w:val="22"/>
+                <w:sz w:val="21"/>
               </w:rPr>
               <w:t>Sistemas Inteligentes y Machine Learning</w:t>
             </w:r>
@@ -155,7 +152,7 @@
                 <w:rFonts w:ascii="Calibri" w:hAnsi="Calibri"/>
                 <w:b/>
                 <w:color w:val="003366"/>
-                <w:sz w:val="22"/>
+                <w:sz w:val="21"/>
               </w:rPr>
               <w:t>Ciclo Académico:</w:t>
             </w:r>
@@ -173,7 +170,7 @@
               <w:rPr>
                 <w:rFonts w:ascii="Calibri" w:hAnsi="Calibri"/>
                 <w:color w:val="282828"/>
-                <w:sz w:val="22"/>
+                <w:sz w:val="21"/>
               </w:rPr>
               <w:t>9no Ciclo</w:t>
             </w:r>
@@ -194,7 +191,7 @@
                 <w:rFonts w:ascii="Calibri" w:hAnsi="Calibri"/>
                 <w:b/>
                 <w:color w:val="003366"/>
-                <w:sz w:val="22"/>
+                <w:sz w:val="21"/>
               </w:rPr>
               <w:t>Docente:</w:t>
             </w:r>
@@ -212,7 +209,7 @@
               <w:rPr>
                 <w:rFonts w:ascii="Calibri" w:hAnsi="Calibri"/>
                 <w:color w:val="282828"/>
-                <w:sz w:val="22"/>
+                <w:sz w:val="21"/>
               </w:rPr>
               <w:t>Mg. José Antonio Ogosi Auqui</w:t>
             </w:r>
@@ -233,9 +230,9 @@
                 <w:rFonts w:ascii="Calibri" w:hAnsi="Calibri"/>
                 <w:b/>
                 <w:color w:val="003366"/>
-                <w:sz w:val="22"/>
+                <w:sz w:val="21"/>
               </w:rPr>
-              <w:t>Estudiante:</w:t>
+              <w:t>Autores / Integrantes:</w:t>
             </w:r>
           </w:p>
         </w:tc>
@@ -251,9 +248,11 @@
               <w:rPr>
                 <w:rFonts w:ascii="Calibri" w:hAnsi="Calibri"/>
                 <w:color w:val="282828"/>
-                <w:sz w:val="22"/>
+                <w:sz w:val="21"/>
               </w:rPr>
-              <w:t>Manuel Fabrizzio Risco Gil</w:t>
+              <w:t>• Manuel Fabrizzio Risco Gil</w:t>
+              <w:br/>
+              <w:t>• Alejandro Choquihuayta, Mario Julian</w:t>
             </w:r>
           </w:p>
         </w:tc>
@@ -272,7 +271,46 @@
                 <w:rFonts w:ascii="Calibri" w:hAnsi="Calibri"/>
                 <w:b/>
                 <w:color w:val="003366"/>
-                <w:sz w:val="22"/>
+                <w:sz w:val="21"/>
+              </w:rPr>
+              <w:t>Hardware &amp; Despliegue:</w:t>
+            </w:r>
+          </w:p>
+        </w:tc>
+        <w:tc>
+          <w:tcPr>
+            <w:tcW w:type="dxa" w:w="4561"/>
+          </w:tcPr>
+          <w:p>
+            <w:pPr>
+              <w:jc w:val="left"/>
+            </w:pPr>
+            <w:r>
+              <w:rPr>
+                <w:rFonts w:ascii="Calibri" w:hAnsi="Calibri"/>
+                <w:color w:val="282828"/>
+                <w:sz w:val="21"/>
+              </w:rPr>
+              <w:t>GPU NVIDIA RTX 5060 Ti 16GB (CUDA 12.8) / Exportación Universal ONNX</w:t>
+            </w:r>
+          </w:p>
+        </w:tc>
+      </w:tr>
+      <w:tr>
+        <w:tc>
+          <w:tcPr>
+            <w:tcW w:type="dxa" w:w="4561"/>
+          </w:tcPr>
+          <w:p>
+            <w:pPr>
+              <w:jc w:val="right"/>
+            </w:pPr>
+            <w:r>
+              <w:rPr>
+                <w:rFonts w:ascii="Calibri" w:hAnsi="Calibri"/>
+                <w:b/>
+                <w:color w:val="003366"/>
+                <w:sz w:val="21"/>
               </w:rPr>
               <w:t>Año Académico:</w:t>
             </w:r>
@@ -290,7 +328,7 @@
               <w:rPr>
                 <w:rFonts w:ascii="Calibri" w:hAnsi="Calibri"/>
                 <w:color w:val="282828"/>
-                <w:sz w:val="22"/>
+                <w:sz w:val="21"/>
               </w:rPr>
               <w:t>2026</w:t>
             </w:r>
@@ -354,7 +392,7 @@
                 <w:color w:val="FFFFFF"/>
                 <w:sz w:val="20"/>
               </w:rPr>
-              <w:t>Sección</w:t>
+              <w:t>N°</w:t>
             </w:r>
           </w:p>
         </w:tc>
@@ -381,7 +419,7 @@
                 <w:color w:val="FFFFFF"/>
                 <w:sz w:val="20"/>
               </w:rPr>
-              <w:t>Título del Contenido</w:t>
+              <w:t>Sección / Contenido</w:t>
             </w:r>
           </w:p>
         </w:tc>
@@ -542,167 +580,7 @@
                 <w:color w:val="282828"/>
                 <w:sz w:val="19"/>
               </w:rPr>
-              <w:t>OBJETIVOS DEL PROYECTO</w:t>
-            </w:r>
-          </w:p>
-        </w:tc>
-        <w:tc>
-          <w:tcPr>
-            <w:tcW w:type="dxa" w:w="3041"/>
-            <w:shd w:fill="F4F6F9"/>
-            <w:tcMar>
-              <w:top w:w="80" w:type="dxa"/>
-              <w:bottom w:w="80" w:type="dxa"/>
-              <w:left w:w="120" w:type="dxa"/>
-              <w:right w:w="120" w:type="dxa"/>
-            </w:tcMar>
-            <w:vAlign w:val="center"/>
-          </w:tcPr>
-          <w:p>
-            <w:pPr>
-              <w:jc w:val="center"/>
-            </w:pPr>
-            <w:r>
-              <w:rPr>
-                <w:rFonts w:ascii="Calibri" w:hAnsi="Calibri"/>
-                <w:color w:val="282828"/>
-                <w:sz w:val="19"/>
-              </w:rPr>
-              <w:t>3</w:t>
-            </w:r>
-          </w:p>
-        </w:tc>
-      </w:tr>
-      <w:tr>
-        <w:tc>
-          <w:tcPr>
-            <w:tcW w:type="dxa" w:w="3041"/>
-            <w:shd w:fill="FFFFFF"/>
-            <w:tcMar>
-              <w:top w:w="80" w:type="dxa"/>
-              <w:bottom w:w="80" w:type="dxa"/>
-              <w:left w:w="120" w:type="dxa"/>
-              <w:right w:w="120" w:type="dxa"/>
-            </w:tcMar>
-            <w:vAlign w:val="center"/>
-          </w:tcPr>
-          <w:p>
-            <w:pPr>
-              <w:jc w:val="center"/>
-            </w:pPr>
-            <w:r>
-              <w:rPr>
-                <w:rFonts w:ascii="Calibri" w:hAnsi="Calibri"/>
-                <w:color w:val="282828"/>
-                <w:sz w:val="19"/>
-              </w:rPr>
-              <w:t xml:space="preserve">  2.1.</w:t>
-            </w:r>
-          </w:p>
-        </w:tc>
-        <w:tc>
-          <w:tcPr>
-            <w:tcW w:type="dxa" w:w="3041"/>
-            <w:shd w:fill="FFFFFF"/>
-            <w:tcMar>
-              <w:top w:w="80" w:type="dxa"/>
-              <w:bottom w:w="80" w:type="dxa"/>
-              <w:left w:w="120" w:type="dxa"/>
-              <w:right w:w="120" w:type="dxa"/>
-            </w:tcMar>
-            <w:vAlign w:val="center"/>
-          </w:tcPr>
-          <w:p>
-            <w:pPr>
-              <w:jc w:val="left"/>
-            </w:pPr>
-            <w:r>
-              <w:rPr>
-                <w:rFonts w:ascii="Calibri" w:hAnsi="Calibri"/>
-                <w:color w:val="282828"/>
-                <w:sz w:val="19"/>
-              </w:rPr>
-              <w:t>Objetivo General</w:t>
-            </w:r>
-          </w:p>
-        </w:tc>
-        <w:tc>
-          <w:tcPr>
-            <w:tcW w:type="dxa" w:w="3041"/>
-            <w:shd w:fill="FFFFFF"/>
-            <w:tcMar>
-              <w:top w:w="80" w:type="dxa"/>
-              <w:bottom w:w="80" w:type="dxa"/>
-              <w:left w:w="120" w:type="dxa"/>
-              <w:right w:w="120" w:type="dxa"/>
-            </w:tcMar>
-            <w:vAlign w:val="center"/>
-          </w:tcPr>
-          <w:p>
-            <w:pPr>
-              <w:jc w:val="center"/>
-            </w:pPr>
-            <w:r>
-              <w:rPr>
-                <w:rFonts w:ascii="Calibri" w:hAnsi="Calibri"/>
-                <w:color w:val="282828"/>
-                <w:sz w:val="19"/>
-              </w:rPr>
-              <w:t>3</w:t>
-            </w:r>
-          </w:p>
-        </w:tc>
-      </w:tr>
-      <w:tr>
-        <w:tc>
-          <w:tcPr>
-            <w:tcW w:type="dxa" w:w="3041"/>
-            <w:shd w:fill="F4F6F9"/>
-            <w:tcMar>
-              <w:top w:w="80" w:type="dxa"/>
-              <w:bottom w:w="80" w:type="dxa"/>
-              <w:left w:w="120" w:type="dxa"/>
-              <w:right w:w="120" w:type="dxa"/>
-            </w:tcMar>
-            <w:vAlign w:val="center"/>
-          </w:tcPr>
-          <w:p>
-            <w:pPr>
-              <w:jc w:val="center"/>
-            </w:pPr>
-            <w:r>
-              <w:rPr>
-                <w:rFonts w:ascii="Calibri" w:hAnsi="Calibri"/>
-                <w:color w:val="282828"/>
-                <w:sz w:val="19"/>
-              </w:rPr>
-              <w:t xml:space="preserve">  2.2.</w:t>
-            </w:r>
-          </w:p>
-        </w:tc>
-        <w:tc>
-          <w:tcPr>
-            <w:tcW w:type="dxa" w:w="3041"/>
-            <w:shd w:fill="F4F6F9"/>
-            <w:tcMar>
-              <w:top w:w="80" w:type="dxa"/>
-              <w:bottom w:w="80" w:type="dxa"/>
-              <w:left w:w="120" w:type="dxa"/>
-              <w:right w:w="120" w:type="dxa"/>
-            </w:tcMar>
-            <w:vAlign w:val="center"/>
-          </w:tcPr>
-          <w:p>
-            <w:pPr>
-              <w:jc w:val="left"/>
-            </w:pPr>
-            <w:r>
-              <w:rPr>
-                <w:rFonts w:ascii="Calibri" w:hAnsi="Calibri"/>
-                <w:color w:val="282828"/>
-                <w:sz w:val="19"/>
-              </w:rPr>
-              <w:t>Objetivos Específicos</w:t>
+              <w:t>OBJETIVOS DEL PROYECTO (GENERAL Y ESPECÍFICOS)</w:t>
             </w:r>
           </w:p>
         </w:tc>
@@ -782,7 +660,7 @@
                 <w:color w:val="282828"/>
                 <w:sz w:val="19"/>
               </w:rPr>
-              <w:t>MARCO TEÓRICO Y CONCEPTUAL</w:t>
+              <w:t>MARCO TEÓRICO: DEEP LEARNING, RESNET, SE-ATTENTION Y CUDA</w:t>
             </w:r>
           </w:p>
         </w:tc>
@@ -836,7 +714,7 @@
                 <w:color w:val="282828"/>
                 <w:sz w:val="19"/>
               </w:rPr>
-              <w:t xml:space="preserve">  3.1.</w:t>
+              <w:t>4.</w:t>
             </w:r>
           </w:p>
         </w:tc>
@@ -862,327 +740,7 @@
                 <w:color w:val="282828"/>
                 <w:sz w:val="19"/>
               </w:rPr>
-              <w:t>Inteligencia Artificial y Aprendizaje Supervisado</w:t>
-            </w:r>
-          </w:p>
-        </w:tc>
-        <w:tc>
-          <w:tcPr>
-            <w:tcW w:type="dxa" w:w="3041"/>
-            <w:shd w:fill="F4F6F9"/>
-            <w:tcMar>
-              <w:top w:w="80" w:type="dxa"/>
-              <w:bottom w:w="80" w:type="dxa"/>
-              <w:left w:w="120" w:type="dxa"/>
-              <w:right w:w="120" w:type="dxa"/>
-            </w:tcMar>
-            <w:vAlign w:val="center"/>
-          </w:tcPr>
-          <w:p>
-            <w:pPr>
-              <w:jc w:val="center"/>
-            </w:pPr>
-            <w:r>
-              <w:rPr>
-                <w:rFonts w:ascii="Calibri" w:hAnsi="Calibri"/>
-                <w:color w:val="282828"/>
-                <w:sz w:val="19"/>
-              </w:rPr>
-              <w:t>4</w:t>
-            </w:r>
-          </w:p>
-        </w:tc>
-      </w:tr>
-      <w:tr>
-        <w:tc>
-          <w:tcPr>
-            <w:tcW w:type="dxa" w:w="3041"/>
-            <w:shd w:fill="FFFFFF"/>
-            <w:tcMar>
-              <w:top w:w="80" w:type="dxa"/>
-              <w:bottom w:w="80" w:type="dxa"/>
-              <w:left w:w="120" w:type="dxa"/>
-              <w:right w:w="120" w:type="dxa"/>
-            </w:tcMar>
-            <w:vAlign w:val="center"/>
-          </w:tcPr>
-          <w:p>
-            <w:pPr>
-              <w:jc w:val="center"/>
-            </w:pPr>
-            <w:r>
-              <w:rPr>
-                <w:rFonts w:ascii="Calibri" w:hAnsi="Calibri"/>
-                <w:color w:val="282828"/>
-                <w:sz w:val="19"/>
-              </w:rPr>
-              <w:t xml:space="preserve">  3.2.</w:t>
-            </w:r>
-          </w:p>
-        </w:tc>
-        <w:tc>
-          <w:tcPr>
-            <w:tcW w:type="dxa" w:w="3041"/>
-            <w:shd w:fill="FFFFFF"/>
-            <w:tcMar>
-              <w:top w:w="80" w:type="dxa"/>
-              <w:bottom w:w="80" w:type="dxa"/>
-              <w:left w:w="120" w:type="dxa"/>
-              <w:right w:w="120" w:type="dxa"/>
-            </w:tcMar>
-            <w:vAlign w:val="center"/>
-          </w:tcPr>
-          <w:p>
-            <w:pPr>
-              <w:jc w:val="left"/>
-            </w:pPr>
-            <w:r>
-              <w:rPr>
-                <w:rFonts w:ascii="Calibri" w:hAnsi="Calibri"/>
-                <w:color w:val="282828"/>
-                <w:sz w:val="19"/>
-              </w:rPr>
-              <w:t>Deep Learning y Representación Jerárquica</w:t>
-            </w:r>
-          </w:p>
-        </w:tc>
-        <w:tc>
-          <w:tcPr>
-            <w:tcW w:type="dxa" w:w="3041"/>
-            <w:shd w:fill="FFFFFF"/>
-            <w:tcMar>
-              <w:top w:w="80" w:type="dxa"/>
-              <w:bottom w:w="80" w:type="dxa"/>
-              <w:left w:w="120" w:type="dxa"/>
-              <w:right w:w="120" w:type="dxa"/>
-            </w:tcMar>
-            <w:vAlign w:val="center"/>
-          </w:tcPr>
-          <w:p>
-            <w:pPr>
-              <w:jc w:val="center"/>
-            </w:pPr>
-            <w:r>
-              <w:rPr>
-                <w:rFonts w:ascii="Calibri" w:hAnsi="Calibri"/>
-                <w:color w:val="282828"/>
-                <w:sz w:val="19"/>
-              </w:rPr>
-              <w:t>4</w:t>
-            </w:r>
-          </w:p>
-        </w:tc>
-      </w:tr>
-      <w:tr>
-        <w:tc>
-          <w:tcPr>
-            <w:tcW w:type="dxa" w:w="3041"/>
-            <w:shd w:fill="F4F6F9"/>
-            <w:tcMar>
-              <w:top w:w="80" w:type="dxa"/>
-              <w:bottom w:w="80" w:type="dxa"/>
-              <w:left w:w="120" w:type="dxa"/>
-              <w:right w:w="120" w:type="dxa"/>
-            </w:tcMar>
-            <w:vAlign w:val="center"/>
-          </w:tcPr>
-          <w:p>
-            <w:pPr>
-              <w:jc w:val="center"/>
-            </w:pPr>
-            <w:r>
-              <w:rPr>
-                <w:rFonts w:ascii="Calibri" w:hAnsi="Calibri"/>
-                <w:color w:val="282828"/>
-                <w:sz w:val="19"/>
-              </w:rPr>
-              <w:t xml:space="preserve">  3.3.</w:t>
-            </w:r>
-          </w:p>
-        </w:tc>
-        <w:tc>
-          <w:tcPr>
-            <w:tcW w:type="dxa" w:w="3041"/>
-            <w:shd w:fill="F4F6F9"/>
-            <w:tcMar>
-              <w:top w:w="80" w:type="dxa"/>
-              <w:bottom w:w="80" w:type="dxa"/>
-              <w:left w:w="120" w:type="dxa"/>
-              <w:right w:w="120" w:type="dxa"/>
-            </w:tcMar>
-            <w:vAlign w:val="center"/>
-          </w:tcPr>
-          <w:p>
-            <w:pPr>
-              <w:jc w:val="left"/>
-            </w:pPr>
-            <w:r>
-              <w:rPr>
-                <w:rFonts w:ascii="Calibri" w:hAnsi="Calibri"/>
-                <w:color w:val="282828"/>
-                <w:sz w:val="19"/>
-              </w:rPr>
-              <w:t>Redes Neuronales Convolucionales (CNN)</w:t>
-            </w:r>
-          </w:p>
-        </w:tc>
-        <w:tc>
-          <w:tcPr>
-            <w:tcW w:type="dxa" w:w="3041"/>
-            <w:shd w:fill="F4F6F9"/>
-            <w:tcMar>
-              <w:top w:w="80" w:type="dxa"/>
-              <w:bottom w:w="80" w:type="dxa"/>
-              <w:left w:w="120" w:type="dxa"/>
-              <w:right w:w="120" w:type="dxa"/>
-            </w:tcMar>
-            <w:vAlign w:val="center"/>
-          </w:tcPr>
-          <w:p>
-            <w:pPr>
-              <w:jc w:val="center"/>
-            </w:pPr>
-            <w:r>
-              <w:rPr>
-                <w:rFonts w:ascii="Calibri" w:hAnsi="Calibri"/>
-                <w:color w:val="282828"/>
-                <w:sz w:val="19"/>
-              </w:rPr>
-              <w:t>4</w:t>
-            </w:r>
-          </w:p>
-        </w:tc>
-      </w:tr>
-      <w:tr>
-        <w:tc>
-          <w:tcPr>
-            <w:tcW w:type="dxa" w:w="3041"/>
-            <w:shd w:fill="FFFFFF"/>
-            <w:tcMar>
-              <w:top w:w="80" w:type="dxa"/>
-              <w:bottom w:w="80" w:type="dxa"/>
-              <w:left w:w="120" w:type="dxa"/>
-              <w:right w:w="120" w:type="dxa"/>
-            </w:tcMar>
-            <w:vAlign w:val="center"/>
-          </w:tcPr>
-          <w:p>
-            <w:pPr>
-              <w:jc w:val="center"/>
-            </w:pPr>
-            <w:r>
-              <w:rPr>
-                <w:rFonts w:ascii="Calibri" w:hAnsi="Calibri"/>
-                <w:color w:val="282828"/>
-                <w:sz w:val="19"/>
-              </w:rPr>
-              <w:t xml:space="preserve">  3.4.</w:t>
-            </w:r>
-          </w:p>
-        </w:tc>
-        <w:tc>
-          <w:tcPr>
-            <w:tcW w:type="dxa" w:w="3041"/>
-            <w:shd w:fill="FFFFFF"/>
-            <w:tcMar>
-              <w:top w:w="80" w:type="dxa"/>
-              <w:bottom w:w="80" w:type="dxa"/>
-              <w:left w:w="120" w:type="dxa"/>
-              <w:right w:w="120" w:type="dxa"/>
-            </w:tcMar>
-            <w:vAlign w:val="center"/>
-          </w:tcPr>
-          <w:p>
-            <w:pPr>
-              <w:jc w:val="left"/>
-            </w:pPr>
-            <w:r>
-              <w:rPr>
-                <w:rFonts w:ascii="Calibri" w:hAnsi="Calibri"/>
-                <w:color w:val="282828"/>
-                <w:sz w:val="19"/>
-              </w:rPr>
-              <w:t>Componentes y Bloques de la Arquitectura</w:t>
-            </w:r>
-          </w:p>
-        </w:tc>
-        <w:tc>
-          <w:tcPr>
-            <w:tcW w:type="dxa" w:w="3041"/>
-            <w:shd w:fill="FFFFFF"/>
-            <w:tcMar>
-              <w:top w:w="80" w:type="dxa"/>
-              <w:bottom w:w="80" w:type="dxa"/>
-              <w:left w:w="120" w:type="dxa"/>
-              <w:right w:w="120" w:type="dxa"/>
-            </w:tcMar>
-            <w:vAlign w:val="center"/>
-          </w:tcPr>
-          <w:p>
-            <w:pPr>
-              <w:jc w:val="center"/>
-            </w:pPr>
-            <w:r>
-              <w:rPr>
-                <w:rFonts w:ascii="Calibri" w:hAnsi="Calibri"/>
-                <w:color w:val="282828"/>
-                <w:sz w:val="19"/>
-              </w:rPr>
-              <w:t>5</w:t>
-            </w:r>
-          </w:p>
-        </w:tc>
-      </w:tr>
-      <w:tr>
-        <w:tc>
-          <w:tcPr>
-            <w:tcW w:type="dxa" w:w="3041"/>
-            <w:shd w:fill="F4F6F9"/>
-            <w:tcMar>
-              <w:top w:w="80" w:type="dxa"/>
-              <w:bottom w:w="80" w:type="dxa"/>
-              <w:left w:w="120" w:type="dxa"/>
-              <w:right w:w="120" w:type="dxa"/>
-            </w:tcMar>
-            <w:vAlign w:val="center"/>
-          </w:tcPr>
-          <w:p>
-            <w:pPr>
-              <w:jc w:val="center"/>
-            </w:pPr>
-            <w:r>
-              <w:rPr>
-                <w:rFonts w:ascii="Calibri" w:hAnsi="Calibri"/>
-                <w:color w:val="282828"/>
-                <w:sz w:val="19"/>
-              </w:rPr>
-              <w:t xml:space="preserve">  3.5.</w:t>
-            </w:r>
-          </w:p>
-        </w:tc>
-        <w:tc>
-          <w:tcPr>
-            <w:tcW w:type="dxa" w:w="3041"/>
-            <w:shd w:fill="F4F6F9"/>
-            <w:tcMar>
-              <w:top w:w="80" w:type="dxa"/>
-              <w:bottom w:w="80" w:type="dxa"/>
-              <w:left w:w="120" w:type="dxa"/>
-              <w:right w:w="120" w:type="dxa"/>
-            </w:tcMar>
-            <w:vAlign w:val="center"/>
-          </w:tcPr>
-          <w:p>
-            <w:pPr>
-              <w:jc w:val="left"/>
-            </w:pPr>
-            <w:r>
-              <w:rPr>
-                <w:rFonts w:ascii="Calibri" w:hAnsi="Calibri"/>
-                <w:color w:val="282828"/>
-                <w:sz w:val="19"/>
-              </w:rPr>
-              <w:t>Aceleración por GPU y Cómputo Paralelo CUDA</w:t>
+              <w:t>DATASET FER2013, AUDITORÍA DE PARTICIÓN Y ALOJAMIENTO EN VRAM</w:t>
             </w:r>
           </w:p>
         </w:tc>
@@ -1236,7 +794,7 @@
                 <w:color w:val="282828"/>
                 <w:sz w:val="19"/>
               </w:rPr>
-              <w:t>4.</w:t>
+              <w:t>5.</w:t>
             </w:r>
           </w:p>
         </w:tc>
@@ -1262,7 +820,7 @@
                 <w:color w:val="282828"/>
                 <w:sz w:val="19"/>
               </w:rPr>
-              <w:t>DATASET FER2013 Y PREPROCESAMIENTO</w:t>
+              <w:t>ARQUITECTURA DE LAS REDES (EmotionResNetSE y EmotionCNN)</w:t>
             </w:r>
           </w:p>
         </w:tc>
@@ -1316,7 +874,7 @@
                 <w:color w:val="282828"/>
                 <w:sz w:val="19"/>
               </w:rPr>
-              <w:t xml:space="preserve">  4.1.</w:t>
+              <w:t>6.</w:t>
             </w:r>
           </w:p>
         </w:tc>
@@ -1342,167 +900,7 @@
                 <w:color w:val="282828"/>
                 <w:sz w:val="19"/>
               </w:rPr>
-              <w:t>Estructura y Clases de Emociones</w:t>
-            </w:r>
-          </w:p>
-        </w:tc>
-        <w:tc>
-          <w:tcPr>
-            <w:tcW w:type="dxa" w:w="3041"/>
-            <w:shd w:fill="F4F6F9"/>
-            <w:tcMar>
-              <w:top w:w="80" w:type="dxa"/>
-              <w:bottom w:w="80" w:type="dxa"/>
-              <w:left w:w="120" w:type="dxa"/>
-              <w:right w:w="120" w:type="dxa"/>
-            </w:tcMar>
-            <w:vAlign w:val="center"/>
-          </w:tcPr>
-          <w:p>
-            <w:pPr>
-              <w:jc w:val="center"/>
-            </w:pPr>
-            <w:r>
-              <w:rPr>
-                <w:rFonts w:ascii="Calibri" w:hAnsi="Calibri"/>
-                <w:color w:val="282828"/>
-                <w:sz w:val="19"/>
-              </w:rPr>
-              <w:t>6</w:t>
-            </w:r>
-          </w:p>
-        </w:tc>
-      </w:tr>
-      <w:tr>
-        <w:tc>
-          <w:tcPr>
-            <w:tcW w:type="dxa" w:w="3041"/>
-            <w:shd w:fill="FFFFFF"/>
-            <w:tcMar>
-              <w:top w:w="80" w:type="dxa"/>
-              <w:bottom w:w="80" w:type="dxa"/>
-              <w:left w:w="120" w:type="dxa"/>
-              <w:right w:w="120" w:type="dxa"/>
-            </w:tcMar>
-            <w:vAlign w:val="center"/>
-          </w:tcPr>
-          <w:p>
-            <w:pPr>
-              <w:jc w:val="center"/>
-            </w:pPr>
-            <w:r>
-              <w:rPr>
-                <w:rFonts w:ascii="Calibri" w:hAnsi="Calibri"/>
-                <w:color w:val="282828"/>
-                <w:sz w:val="19"/>
-              </w:rPr>
-              <w:t xml:space="preserve">  4.2.</w:t>
-            </w:r>
-          </w:p>
-        </w:tc>
-        <w:tc>
-          <w:tcPr>
-            <w:tcW w:type="dxa" w:w="3041"/>
-            <w:shd w:fill="FFFFFF"/>
-            <w:tcMar>
-              <w:top w:w="80" w:type="dxa"/>
-              <w:bottom w:w="80" w:type="dxa"/>
-              <w:left w:w="120" w:type="dxa"/>
-              <w:right w:w="120" w:type="dxa"/>
-            </w:tcMar>
-            <w:vAlign w:val="center"/>
-          </w:tcPr>
-          <w:p>
-            <w:pPr>
-              <w:jc w:val="left"/>
-            </w:pPr>
-            <w:r>
-              <w:rPr>
-                <w:rFonts w:ascii="Calibri" w:hAnsi="Calibri"/>
-                <w:color w:val="282828"/>
-                <w:sz w:val="19"/>
-              </w:rPr>
-              <w:t>Desbalance de Clases y Data Augmentation</w:t>
-            </w:r>
-          </w:p>
-        </w:tc>
-        <w:tc>
-          <w:tcPr>
-            <w:tcW w:type="dxa" w:w="3041"/>
-            <w:shd w:fill="FFFFFF"/>
-            <w:tcMar>
-              <w:top w:w="80" w:type="dxa"/>
-              <w:bottom w:w="80" w:type="dxa"/>
-              <w:left w:w="120" w:type="dxa"/>
-              <w:right w:w="120" w:type="dxa"/>
-            </w:tcMar>
-            <w:vAlign w:val="center"/>
-          </w:tcPr>
-          <w:p>
-            <w:pPr>
-              <w:jc w:val="center"/>
-            </w:pPr>
-            <w:r>
-              <w:rPr>
-                <w:rFonts w:ascii="Calibri" w:hAnsi="Calibri"/>
-                <w:color w:val="282828"/>
-                <w:sz w:val="19"/>
-              </w:rPr>
-              <w:t>6</w:t>
-            </w:r>
-          </w:p>
-        </w:tc>
-      </w:tr>
-      <w:tr>
-        <w:tc>
-          <w:tcPr>
-            <w:tcW w:type="dxa" w:w="3041"/>
-            <w:shd w:fill="F4F6F9"/>
-            <w:tcMar>
-              <w:top w:w="80" w:type="dxa"/>
-              <w:bottom w:w="80" w:type="dxa"/>
-              <w:left w:w="120" w:type="dxa"/>
-              <w:right w:w="120" w:type="dxa"/>
-            </w:tcMar>
-            <w:vAlign w:val="center"/>
-          </w:tcPr>
-          <w:p>
-            <w:pPr>
-              <w:jc w:val="center"/>
-            </w:pPr>
-            <w:r>
-              <w:rPr>
-                <w:rFonts w:ascii="Calibri" w:hAnsi="Calibri"/>
-                <w:color w:val="282828"/>
-                <w:sz w:val="19"/>
-              </w:rPr>
-              <w:t>5.</w:t>
-            </w:r>
-          </w:p>
-        </w:tc>
-        <w:tc>
-          <w:tcPr>
-            <w:tcW w:type="dxa" w:w="3041"/>
-            <w:shd w:fill="F4F6F9"/>
-            <w:tcMar>
-              <w:top w:w="80" w:type="dxa"/>
-              <w:bottom w:w="80" w:type="dxa"/>
-              <w:left w:w="120" w:type="dxa"/>
-              <w:right w:w="120" w:type="dxa"/>
-            </w:tcMar>
-            <w:vAlign w:val="center"/>
-          </w:tcPr>
-          <w:p>
-            <w:pPr>
-              <w:jc w:val="left"/>
-            </w:pPr>
-            <w:r>
-              <w:rPr>
-                <w:rFonts w:ascii="Calibri" w:hAnsi="Calibri"/>
-                <w:color w:val="282828"/>
-                <w:sz w:val="19"/>
-              </w:rPr>
-              <w:t>ARQUITECTURA DEL MODELO EMOTIONCNN</w:t>
+              <w:t>METODOLOGÍA DE ENTRENAMIENTO, CLASS WEIGHTS Y LABEL SMOOTHING</w:t>
             </w:r>
           </w:p>
         </w:tc>
@@ -1556,7 +954,7 @@
                 <w:color w:val="282828"/>
                 <w:sz w:val="19"/>
               </w:rPr>
-              <w:t>6.</w:t>
+              <w:t>7.</w:t>
             </w:r>
           </w:p>
         </w:tc>
@@ -1582,7 +980,7 @@
                 <w:color w:val="282828"/>
                 <w:sz w:val="19"/>
               </w:rPr>
-              <w:t>METODOLOGÍA EXPERIMENTAL Y ENTRENAMIENTO</w:t>
+              <w:t>RESULTADOS EXPERIMENTALES Y EVALUACIÓN RIGUROSA EN TEST SET</w:t>
             </w:r>
           </w:p>
         </w:tc>
@@ -1636,7 +1034,7 @@
                 <w:color w:val="282828"/>
                 <w:sz w:val="19"/>
               </w:rPr>
-              <w:t xml:space="preserve">  6.1.</w:t>
+              <w:t>8.</w:t>
             </w:r>
           </w:p>
         </w:tc>
@@ -1662,327 +1060,7 @@
                 <w:color w:val="282828"/>
                 <w:sz w:val="19"/>
               </w:rPr>
-              <w:t>Función de Pérdida y Optimizador</w:t>
-            </w:r>
-          </w:p>
-        </w:tc>
-        <w:tc>
-          <w:tcPr>
-            <w:tcW w:type="dxa" w:w="3041"/>
-            <w:shd w:fill="F4F6F9"/>
-            <w:tcMar>
-              <w:top w:w="80" w:type="dxa"/>
-              <w:bottom w:w="80" w:type="dxa"/>
-              <w:left w:w="120" w:type="dxa"/>
-              <w:right w:w="120" w:type="dxa"/>
-            </w:tcMar>
-            <w:vAlign w:val="center"/>
-          </w:tcPr>
-          <w:p>
-            <w:pPr>
-              <w:jc w:val="center"/>
-            </w:pPr>
-            <w:r>
-              <w:rPr>
-                <w:rFonts w:ascii="Calibri" w:hAnsi="Calibri"/>
-                <w:color w:val="282828"/>
-                <w:sz w:val="19"/>
-              </w:rPr>
-              <w:t>8</w:t>
-            </w:r>
-          </w:p>
-        </w:tc>
-      </w:tr>
-      <w:tr>
-        <w:tc>
-          <w:tcPr>
-            <w:tcW w:type="dxa" w:w="3041"/>
-            <w:shd w:fill="FFFFFF"/>
-            <w:tcMar>
-              <w:top w:w="80" w:type="dxa"/>
-              <w:bottom w:w="80" w:type="dxa"/>
-              <w:left w:w="120" w:type="dxa"/>
-              <w:right w:w="120" w:type="dxa"/>
-            </w:tcMar>
-            <w:vAlign w:val="center"/>
-          </w:tcPr>
-          <w:p>
-            <w:pPr>
-              <w:jc w:val="center"/>
-            </w:pPr>
-            <w:r>
-              <w:rPr>
-                <w:rFonts w:ascii="Calibri" w:hAnsi="Calibri"/>
-                <w:color w:val="282828"/>
-                <w:sz w:val="19"/>
-              </w:rPr>
-              <w:t xml:space="preserve">  6.2.</w:t>
-            </w:r>
-          </w:p>
-        </w:tc>
-        <w:tc>
-          <w:tcPr>
-            <w:tcW w:type="dxa" w:w="3041"/>
-            <w:shd w:fill="FFFFFF"/>
-            <w:tcMar>
-              <w:top w:w="80" w:type="dxa"/>
-              <w:bottom w:w="80" w:type="dxa"/>
-              <w:left w:w="120" w:type="dxa"/>
-              <w:right w:w="120" w:type="dxa"/>
-            </w:tcMar>
-            <w:vAlign w:val="center"/>
-          </w:tcPr>
-          <w:p>
-            <w:pPr>
-              <w:jc w:val="left"/>
-            </w:pPr>
-            <w:r>
-              <w:rPr>
-                <w:rFonts w:ascii="Calibri" w:hAnsi="Calibri"/>
-                <w:color w:val="282828"/>
-                <w:sz w:val="19"/>
-              </w:rPr>
-              <w:t>Políticas de Regularización y Early Stopping</w:t>
-            </w:r>
-          </w:p>
-        </w:tc>
-        <w:tc>
-          <w:tcPr>
-            <w:tcW w:type="dxa" w:w="3041"/>
-            <w:shd w:fill="FFFFFF"/>
-            <w:tcMar>
-              <w:top w:w="80" w:type="dxa"/>
-              <w:bottom w:w="80" w:type="dxa"/>
-              <w:left w:w="120" w:type="dxa"/>
-              <w:right w:w="120" w:type="dxa"/>
-            </w:tcMar>
-            <w:vAlign w:val="center"/>
-          </w:tcPr>
-          <w:p>
-            <w:pPr>
-              <w:jc w:val="center"/>
-            </w:pPr>
-            <w:r>
-              <w:rPr>
-                <w:rFonts w:ascii="Calibri" w:hAnsi="Calibri"/>
-                <w:color w:val="282828"/>
-                <w:sz w:val="19"/>
-              </w:rPr>
-              <w:t>8</w:t>
-            </w:r>
-          </w:p>
-        </w:tc>
-      </w:tr>
-      <w:tr>
-        <w:tc>
-          <w:tcPr>
-            <w:tcW w:type="dxa" w:w="3041"/>
-            <w:shd w:fill="F4F6F9"/>
-            <w:tcMar>
-              <w:top w:w="80" w:type="dxa"/>
-              <w:bottom w:w="80" w:type="dxa"/>
-              <w:left w:w="120" w:type="dxa"/>
-              <w:right w:w="120" w:type="dxa"/>
-            </w:tcMar>
-            <w:vAlign w:val="center"/>
-          </w:tcPr>
-          <w:p>
-            <w:pPr>
-              <w:jc w:val="center"/>
-            </w:pPr>
-            <w:r>
-              <w:rPr>
-                <w:rFonts w:ascii="Calibri" w:hAnsi="Calibri"/>
-                <w:color w:val="282828"/>
-                <w:sz w:val="19"/>
-              </w:rPr>
-              <w:t>7.</w:t>
-            </w:r>
-          </w:p>
-        </w:tc>
-        <w:tc>
-          <w:tcPr>
-            <w:tcW w:type="dxa" w:w="3041"/>
-            <w:shd w:fill="F4F6F9"/>
-            <w:tcMar>
-              <w:top w:w="80" w:type="dxa"/>
-              <w:bottom w:w="80" w:type="dxa"/>
-              <w:left w:w="120" w:type="dxa"/>
-              <w:right w:w="120" w:type="dxa"/>
-            </w:tcMar>
-            <w:vAlign w:val="center"/>
-          </w:tcPr>
-          <w:p>
-            <w:pPr>
-              <w:jc w:val="left"/>
-            </w:pPr>
-            <w:r>
-              <w:rPr>
-                <w:rFonts w:ascii="Calibri" w:hAnsi="Calibri"/>
-                <w:color w:val="282828"/>
-                <w:sz w:val="19"/>
-              </w:rPr>
-              <w:t>RESULTADOS EXPERIMENTALES Y EVALUACIÓN</w:t>
-            </w:r>
-          </w:p>
-        </w:tc>
-        <w:tc>
-          <w:tcPr>
-            <w:tcW w:type="dxa" w:w="3041"/>
-            <w:shd w:fill="F4F6F9"/>
-            <w:tcMar>
-              <w:top w:w="80" w:type="dxa"/>
-              <w:bottom w:w="80" w:type="dxa"/>
-              <w:left w:w="120" w:type="dxa"/>
-              <w:right w:w="120" w:type="dxa"/>
-            </w:tcMar>
-            <w:vAlign w:val="center"/>
-          </w:tcPr>
-          <w:p>
-            <w:pPr>
-              <w:jc w:val="center"/>
-            </w:pPr>
-            <w:r>
-              <w:rPr>
-                <w:rFonts w:ascii="Calibri" w:hAnsi="Calibri"/>
-                <w:color w:val="282828"/>
-                <w:sz w:val="19"/>
-              </w:rPr>
-              <w:t>9</w:t>
-            </w:r>
-          </w:p>
-        </w:tc>
-      </w:tr>
-      <w:tr>
-        <w:tc>
-          <w:tcPr>
-            <w:tcW w:type="dxa" w:w="3041"/>
-            <w:shd w:fill="FFFFFF"/>
-            <w:tcMar>
-              <w:top w:w="80" w:type="dxa"/>
-              <w:bottom w:w="80" w:type="dxa"/>
-              <w:left w:w="120" w:type="dxa"/>
-              <w:right w:w="120" w:type="dxa"/>
-            </w:tcMar>
-            <w:vAlign w:val="center"/>
-          </w:tcPr>
-          <w:p>
-            <w:pPr>
-              <w:jc w:val="center"/>
-            </w:pPr>
-            <w:r>
-              <w:rPr>
-                <w:rFonts w:ascii="Calibri" w:hAnsi="Calibri"/>
-                <w:color w:val="282828"/>
-                <w:sz w:val="19"/>
-              </w:rPr>
-              <w:t xml:space="preserve">  7.1.</w:t>
-            </w:r>
-          </w:p>
-        </w:tc>
-        <w:tc>
-          <w:tcPr>
-            <w:tcW w:type="dxa" w:w="3041"/>
-            <w:shd w:fill="FFFFFF"/>
-            <w:tcMar>
-              <w:top w:w="80" w:type="dxa"/>
-              <w:bottom w:w="80" w:type="dxa"/>
-              <w:left w:w="120" w:type="dxa"/>
-              <w:right w:w="120" w:type="dxa"/>
-            </w:tcMar>
-            <w:vAlign w:val="center"/>
-          </w:tcPr>
-          <w:p>
-            <w:pPr>
-              <w:jc w:val="left"/>
-            </w:pPr>
-            <w:r>
-              <w:rPr>
-                <w:rFonts w:ascii="Calibri" w:hAnsi="Calibri"/>
-                <w:color w:val="282828"/>
-                <w:sz w:val="19"/>
-              </w:rPr>
-              <w:t>Curvas de Aprendizaje (Loss y Accuracy)</w:t>
-            </w:r>
-          </w:p>
-        </w:tc>
-        <w:tc>
-          <w:tcPr>
-            <w:tcW w:type="dxa" w:w="3041"/>
-            <w:shd w:fill="FFFFFF"/>
-            <w:tcMar>
-              <w:top w:w="80" w:type="dxa"/>
-              <w:bottom w:w="80" w:type="dxa"/>
-              <w:left w:w="120" w:type="dxa"/>
-              <w:right w:w="120" w:type="dxa"/>
-            </w:tcMar>
-            <w:vAlign w:val="center"/>
-          </w:tcPr>
-          <w:p>
-            <w:pPr>
-              <w:jc w:val="center"/>
-            </w:pPr>
-            <w:r>
-              <w:rPr>
-                <w:rFonts w:ascii="Calibri" w:hAnsi="Calibri"/>
-                <w:color w:val="282828"/>
-                <w:sz w:val="19"/>
-              </w:rPr>
-              <w:t>9</w:t>
-            </w:r>
-          </w:p>
-        </w:tc>
-      </w:tr>
-      <w:tr>
-        <w:tc>
-          <w:tcPr>
-            <w:tcW w:type="dxa" w:w="3041"/>
-            <w:shd w:fill="F4F6F9"/>
-            <w:tcMar>
-              <w:top w:w="80" w:type="dxa"/>
-              <w:bottom w:w="80" w:type="dxa"/>
-              <w:left w:w="120" w:type="dxa"/>
-              <w:right w:w="120" w:type="dxa"/>
-            </w:tcMar>
-            <w:vAlign w:val="center"/>
-          </w:tcPr>
-          <w:p>
-            <w:pPr>
-              <w:jc w:val="center"/>
-            </w:pPr>
-            <w:r>
-              <w:rPr>
-                <w:rFonts w:ascii="Calibri" w:hAnsi="Calibri"/>
-                <w:color w:val="282828"/>
-                <w:sz w:val="19"/>
-              </w:rPr>
-              <w:t xml:space="preserve">  7.2.</w:t>
-            </w:r>
-          </w:p>
-        </w:tc>
-        <w:tc>
-          <w:tcPr>
-            <w:tcW w:type="dxa" w:w="3041"/>
-            <w:shd w:fill="F4F6F9"/>
-            <w:tcMar>
-              <w:top w:w="80" w:type="dxa"/>
-              <w:bottom w:w="80" w:type="dxa"/>
-              <w:left w:w="120" w:type="dxa"/>
-              <w:right w:w="120" w:type="dxa"/>
-            </w:tcMar>
-            <w:vAlign w:val="center"/>
-          </w:tcPr>
-          <w:p>
-            <w:pPr>
-              <w:jc w:val="left"/>
-            </w:pPr>
-            <w:r>
-              <w:rPr>
-                <w:rFonts w:ascii="Calibri" w:hAnsi="Calibri"/>
-                <w:color w:val="282828"/>
-                <w:sz w:val="19"/>
-              </w:rPr>
-              <w:t>Matriz de Confusión y Reporte por Emoción</w:t>
+              <w:t>INFERENCIA EN TIEMPO REAL: DETECTOR YuNet Y SUAVIZADO TEMPORAL EMA</w:t>
             </w:r>
           </w:p>
         </w:tc>
@@ -2036,7 +1114,7 @@
                 <w:color w:val="282828"/>
                 <w:sz w:val="19"/>
               </w:rPr>
-              <w:t xml:space="preserve">  7.3.</w:t>
+              <w:t>9.</w:t>
             </w:r>
           </w:p>
         </w:tc>
@@ -2062,7 +1140,7 @@
                 <w:color w:val="282828"/>
                 <w:sz w:val="19"/>
               </w:rPr>
-              <w:t>Ejemplos de Inferencia Cualitativa</w:t>
+              <w:t>DESPLIEGUE MULTIPLATAFORMA Y EXPORTACIÓN PORTÁTIL (ONNX &amp; OPENCV DNN)</w:t>
             </w:r>
           </w:p>
         </w:tc>
@@ -2116,7 +1194,7 @@
                 <w:color w:val="282828"/>
                 <w:sz w:val="19"/>
               </w:rPr>
-              <w:t>8.</w:t>
+              <w:t>10.</w:t>
             </w:r>
           </w:p>
         </w:tc>
@@ -2142,7 +1220,7 @@
                 <w:color w:val="282828"/>
                 <w:sz w:val="19"/>
               </w:rPr>
-              <w:t>SISTEMA DE INFERENCIA EN TIEMPO REAL (WEBCAM)</w:t>
+              <w:t>CONCLUSIONES Y RECOMENDACIONES TÉCNICAS</w:t>
             </w:r>
           </w:p>
         </w:tc>
@@ -2196,7 +1274,7 @@
                 <w:color w:val="282828"/>
                 <w:sz w:val="19"/>
               </w:rPr>
-              <w:t>9.</w:t>
+              <w:t>11.</w:t>
             </w:r>
           </w:p>
         </w:tc>
@@ -2222,7 +1300,7 @@
                 <w:color w:val="282828"/>
                 <w:sz w:val="19"/>
               </w:rPr>
-              <w:t>CONCLUSIONES Y RECOMENDACIONES</w:t>
+              <w:t>REFERENCIAS BIBLIOGRÁFICAS (IEEE / APA)</w:t>
             </w:r>
           </w:p>
         </w:tc>
@@ -2253,87 +1331,8 @@
           </w:p>
         </w:tc>
       </w:tr>
-      <w:tr>
-        <w:tc>
-          <w:tcPr>
-            <w:tcW w:type="dxa" w:w="3041"/>
-            <w:shd w:fill="F4F6F9"/>
-            <w:tcMar>
-              <w:top w:w="80" w:type="dxa"/>
-              <w:bottom w:w="80" w:type="dxa"/>
-              <w:left w:w="120" w:type="dxa"/>
-              <w:right w:w="120" w:type="dxa"/>
-            </w:tcMar>
-            <w:vAlign w:val="center"/>
-          </w:tcPr>
-          <w:p>
-            <w:pPr>
-              <w:jc w:val="center"/>
-            </w:pPr>
-            <w:r>
-              <w:rPr>
-                <w:rFonts w:ascii="Calibri" w:hAnsi="Calibri"/>
-                <w:color w:val="282828"/>
-                <w:sz w:val="19"/>
-              </w:rPr>
-              <w:t>10.</w:t>
-            </w:r>
-          </w:p>
-        </w:tc>
-        <w:tc>
-          <w:tcPr>
-            <w:tcW w:type="dxa" w:w="3041"/>
-            <w:shd w:fill="F4F6F9"/>
-            <w:tcMar>
-              <w:top w:w="80" w:type="dxa"/>
-              <w:bottom w:w="80" w:type="dxa"/>
-              <w:left w:w="120" w:type="dxa"/>
-              <w:right w:w="120" w:type="dxa"/>
-            </w:tcMar>
-            <w:vAlign w:val="center"/>
-          </w:tcPr>
-          <w:p>
-            <w:pPr>
-              <w:jc w:val="left"/>
-            </w:pPr>
-            <w:r>
-              <w:rPr>
-                <w:rFonts w:ascii="Calibri" w:hAnsi="Calibri"/>
-                <w:color w:val="282828"/>
-                <w:sz w:val="19"/>
-              </w:rPr>
-              <w:t>REFERENCIAS BIBLIOGRÁFICAS</w:t>
-            </w:r>
-          </w:p>
-        </w:tc>
-        <w:tc>
-          <w:tcPr>
-            <w:tcW w:type="dxa" w:w="3041"/>
-            <w:shd w:fill="F4F6F9"/>
-            <w:tcMar>
-              <w:top w:w="80" w:type="dxa"/>
-              <w:bottom w:w="80" w:type="dxa"/>
-              <w:left w:w="120" w:type="dxa"/>
-              <w:right w:w="120" w:type="dxa"/>
-            </w:tcMar>
-            <w:vAlign w:val="center"/>
-          </w:tcPr>
-          <w:p>
-            <w:pPr>
-              <w:jc w:val="center"/>
-            </w:pPr>
-            <w:r>
-              <w:rPr>
-                <w:rFonts w:ascii="Calibri" w:hAnsi="Calibri"/>
-                <w:color w:val="282828"/>
-                <w:sz w:val="19"/>
-              </w:rPr>
-              <w:t>14</w:t>
-            </w:r>
-          </w:p>
-        </w:tc>
-      </w:tr>
     </w:tbl>
+    <w:p/>
     <w:p>
       <w:r>
         <w:br w:type="page"/>
@@ -2368,7 +1367,7 @@
           <w:color w:val="1E1E1E"/>
           <w:sz w:val="22"/>
         </w:rPr>
-        <w:t>El reconocimiento automático de emociones humanas a través del análisis de expresiones faciales constituye uno de los desafíos más prominentes en el área de Visión por Computadora e Interacción Humano-Computador (HCI). Las microexpresiones y movimientos musculares de la cara reflejan estados afectivos universales que permiten a los sistemas inteligentes interpretar de manera empática el comportamiento del usuario en entornos de educación virtual, diagnóstico clínico, asistencia al conductor y monitoreo de seguridad.</w:t>
+        <w:t>El reconocimiento automático de emociones faciales (Facial Expression Recognition - FER) constituye uno de los pilares de mayor relevancia en la Visión por Computadora y la Interacción Humano-Computador (HCI). Permite dotar a los sistemas inteligentes de empatía artificial y capacidades de análisis conductual para entornos como la educación adaptativa, monitoreo de fatiga en conductores, telemedicina y seguridad inteligente.</w:t>
       </w:r>
     </w:p>
     <w:p>
@@ -2385,7 +1384,7 @@
           <w:color w:val="1E1E1E"/>
           <w:sz w:val="22"/>
         </w:rPr>
-        <w:t>Los métodos clásicos de procesamiento digital de imágenes dependían de la extracción manual de características (como descriptores HOG, LBP o filtros Gabor), los cuales presentaban alta sensibilidad ante variaciones de iluminación, oclusiones parciales y diferencias fisonómicas. Con la consolidación del Deep Learning y en particular de las Redes Neuronales Convolucionales (CNN), es posible aprender de manera jerárquica y totalmente automatizada representaciones visuales robustas a partir de grandes volúmenes de datos brutos.</w:t>
+        <w:t>Los métodos clásicos de visión artificial dependían de extractores manuales de rasgos (como filtros Gabor, HOG o LBP) y clasificadores como Haar Cascade, los cuales fallan drásticamente ante giros de cabeza, oclusiones o variaciones de iluminación. Con el desarrollo del Deep Learning moderno, la integración de Bloques Residuales (ResNet) y mecanismos de atención Squeeze-and-Excitation (SE-Attention) permite que las redes neuronales extraigan de forma autónoma y adaptativa las características más discriminativas de cada emoción.</w:t>
       </w:r>
     </w:p>
     <w:p>
@@ -2402,7 +1401,7 @@
           <w:color w:val="1E1E1E"/>
           <w:sz w:val="22"/>
         </w:rPr>
-        <w:t>En el presente proyecto se desarrolla e implementa un sistema integral de clasificación de 7 emociones faciales básicas (Enojado, Disgusto, Miedo, Feliz, Triste, Sorprendido y Neutral) entrenado sobre el benchmark internacional FER2013. Se aprovecha la aceleración por hardware de alta gama (GPU NVIDIA GeForce RTX 5060 Ti con 16GB VRAM mediante PyTorch y CUDA 12.8), integrando módulos de aumento de datos (*Data Augmentation*), reducción dinámica de tasa de aprendizaje (*ReduceLROnPlateau*) y un pipeline de inferencia en tiempo real acoplado a la cámara web con el detector Haar Cascade de OpenCV.</w:t>
+        <w:t>El presente trabajo implementa un sistema integral de alto rendimiento capaz de clasificar 7 emociones básicas (Enojado, Disgusto, Miedo, Feliz, Triste, Sorprendido y Neutral) entrenado sobre el benchmark FER2013. Se diseñó una arquitectura de última generación (EmotionResNetSE) con 11.38 millones de parámetros, balanceo de clases por ponderación de pérdida, carga de datos 100% nativa en VRAM (GPU NVIDIA RTX 5060 Ti con CUDA 12.8), un pipeline de video en tiempo real asistido por el detector neuronal YuNet y un módulo de exportación autónomo en formato universal ONNX para que cualquier computadora ejecute el modelo sin necesidad de GPUs potentes ni PyTorch.</w:t>
       </w:r>
     </w:p>
     <w:p>
@@ -2449,7 +1448,7 @@
           <w:color w:val="1E1E1E"/>
           <w:sz w:val="22"/>
         </w:rPr>
-        <w:t>Diseñar, entrenar y validar una Red Neuronal Convolucional (CNN) profunda optimizada para la clasificación multiclase de 7 emociones faciales sobre el dataset FER2013, aprovechando la aceleración por GPU para lograr un modelo robusto y desplegable en inferencia en tiempo real mediante webcam.</w:t>
+        <w:t>Diseñar, implementar, evaluar rigurosamente y exportar a un paquete autónomo portátil un sistema inteligente de clasificación de emociones faciales mediante Redes Residuales con Atención (EmotionResNetSE), detector neuronal YuNet y OpenCV DNN, alcanzando un desempeño superior al estándar humano sobre FER2013 y permitiendo su uso en cualquier PC.</w:t>
       </w:r>
     </w:p>
     <w:p>
@@ -2475,9 +1474,9 @@
       <w:r>
         <w:rPr>
           <w:rFonts w:ascii="Calibri" w:hAnsi="Calibri"/>
-          <w:sz w:val="22"/>
+          <w:sz w:val="21"/>
         </w:rPr>
-        <w:t>Construir una arquitectura CNN de 4 bloques convolucionales con capas dobles de convolución, Batch Normalization, activaciones ReLU, MaxPooling y regularización por Dropout.</w:t>
+        <w:t>Desarrollar la arquitectura profunda EmotionResNetSE con 4 etapas residuales, atención por canales Squeeze-and-Excitation (SE) y Global Average Pooling (GAP).</w:t>
       </w:r>
     </w:p>
     <w:p>
@@ -2488,9 +1487,9 @@
       <w:r>
         <w:rPr>
           <w:rFonts w:ascii="Calibri" w:hAnsi="Calibri"/>
-          <w:sz w:val="22"/>
+          <w:sz w:val="21"/>
         </w:rPr>
-        <w:t>Implementar un pipeline de preprocesamiento y Data Augmentation (rotación, traslación, flip horizontal, variación de contraste) para mitigar el sobreajuste y compensar el desbalance de clases.</w:t>
+        <w:t>Implementar un mecanismo de carga y aumento de datos 100% residente en VRAM (FastGPUDataLoader), eliminando cuellos de botella de RAM de CPU y latencias PCIe.</w:t>
       </w:r>
     </w:p>
     <w:p>
@@ -2501,9 +1500,9 @@
       <w:r>
         <w:rPr>
           <w:rFonts w:ascii="Calibri" w:hAnsi="Calibri"/>
-          <w:sz w:val="22"/>
+          <w:sz w:val="21"/>
         </w:rPr>
-        <w:t>Acelerar el proceso de entrenamiento utilizando tensores CUDA en la GPU NVIDIA RTX 5060 Ti.</w:t>
+        <w:t>Compensar el desbalance severo de clases de FER2013 mediante Ponderación de Clases (Class Weights) y Label Smoothing en la función Cross-Entropy.</w:t>
       </w:r>
     </w:p>
     <w:p>
@@ -2514,9 +1513,9 @@
       <w:r>
         <w:rPr>
           <w:rFonts w:ascii="Calibri" w:hAnsi="Calibri"/>
-          <w:sz w:val="22"/>
+          <w:sz w:val="21"/>
         </w:rPr>
-        <w:t>Evaluar cuantitativamente el rendimiento del modelo mediante métricas de Accuracy, Precision, Recall, F1-Score y análisis de matriz de confusión normalizada.</w:t>
+        <w:t>Evaluar formalmente el modelo sobre 7,178 imágenes del conjunto de TEST independiente, alcanzando 67.86% de Accuracy y mitigando el sobreajuste mediante Early Stopping.</w:t>
       </w:r>
     </w:p>
     <w:p>
@@ -2527,9 +1526,9 @@
       <w:r>
         <w:rPr>
           <w:rFonts w:ascii="Calibri" w:hAnsi="Calibri"/>
-          <w:sz w:val="22"/>
+          <w:sz w:val="21"/>
         </w:rPr>
-        <w:t>Integrar el modelo entrenado con OpenCV para la detección de rostros y clasificación de expresiones faciales en tiempo real a una tasa superior a 30 cuadros por segundo (FPS).</w:t>
+        <w:t>Integrar el detector neuronal YuNet ONNX para detección facial multi-ángulo (yaw ±90°, pitch y roll) sin falsos positivos en streaming de webcam.</w:t>
       </w:r>
     </w:p>
     <w:p>
@@ -2540,9 +1539,22 @@
       <w:r>
         <w:rPr>
           <w:rFonts w:ascii="Calibri" w:hAnsi="Calibri"/>
-          <w:sz w:val="22"/>
+          <w:sz w:val="21"/>
         </w:rPr>
-        <w:t>Demostrar el flujo integral del aprendizaje supervisado: Entrada (imágenes 48x48) → Proceso (extracción convolucional y optimización de pesos) → Salida (vector de probabilidades por emoción).</w:t>
+        <w:t>Diseñar un filtro de Suavizado Temporal (EMA Tracker) para estabilizar las probabilidades y eliminar el parpadeo de emociones entre fotogramas consecutivos.</w:t>
+      </w:r>
+    </w:p>
+    <w:p>
+      <w:pPr>
+        <w:pStyle w:val="ListBullet"/>
+        <w:spacing w:after="80"/>
+      </w:pPr>
+      <w:r>
+        <w:rPr>
+          <w:rFonts w:ascii="Calibri" w:hAnsi="Calibri"/>
+          <w:sz w:val="21"/>
+        </w:rPr>
+        <w:t>Exportar el modelo completo a formato ONNX universal y compilar un paquete autónomo portátil (.ZIP) que corra en cualquier computadora con solo OpenCV y NumPy.</w:t>
       </w:r>
     </w:p>
     <w:p>
@@ -2577,7 +1589,7 @@
           <w:color w:val="004C99"/>
           <w:sz w:val="26"/>
         </w:rPr>
-        <w:t>3.1. Inteligencia Artificial y Aprendizaje Supervisado</w:t>
+        <w:t>3.1. Deep Learning y Conexiones Residuales (ResNet)</w:t>
       </w:r>
     </w:p>
     <w:p>
@@ -2594,7 +1606,7 @@
           <w:color w:val="1E1E1E"/>
           <w:sz w:val="22"/>
         </w:rPr>
-        <w:t>El Aprendizaje Supervisado es el paradigma del Machine Learning donde un algoritmo ajusta sus parámetros internos a partir de un conjunto de entrenamiento constituido por pares de entrada-salida: D = {(x_i, y_i)}. El objetivo consiste en aprender una función de mapeo f: X → Y que minimice el error empírico sobre muestras no vistas, generalizando el comportamiento aprendido.</w:t>
+        <w:t>En redes convolucionales muy profundas, la propagación repetida de multiplicaciones matriciales provoca el desvanecimiento de los gradientes (*vanishing gradient problem*). Las conexiones residuales (He et al., 2016) introducen atajos directos (*skip connections*) que reformulan el aprendizaje como F(x) + x, permitiendo que el gradiente fluya directamente a las capas iniciales sin atenuación.</w:t>
       </w:r>
     </w:p>
     <w:p>
@@ -2609,7 +1621,7 @@
           <w:color w:val="004C99"/>
           <w:sz w:val="26"/>
         </w:rPr>
-        <w:t>3.2. Deep Learning y Representación Jerárquica</w:t>
+        <w:t>3.2. Mecanismo de Atención Squeeze-and-Excitation (SE Block)</w:t>
       </w:r>
     </w:p>
     <w:p>
@@ -2626,7 +1638,13 @@
           <w:color w:val="1E1E1E"/>
           <w:sz w:val="22"/>
         </w:rPr>
-        <w:t>A diferencia de los modelos estadísticos convencionales que requieren ingeniería manual de atributos, el Deep Learning procesa los datos en niveles sucesivos de abstracción. Las primeras capas de la red capturan primitivas espaciales (gradientes de intensidad, bordes orientados, curvas); las capas intermedias combinan estos patrones en estructuras anatómicas (ojos, nariz, labios); finalmente, las capas superiores integran la geometría facial completa para discriminar la emoción expresada.</w:t>
+        <w:t>El módulo Squeeze-and-Excitation (Hu et al., 2018) modela dinámicamente las interdependencias entre canales:</w:t>
+        <w:br/>
+        <w:t>1. Squeeze: Comprime la información espacial mediante Global Average Pooling a un vector descriptor de canal.</w:t>
+        <w:br/>
+        <w:t>2. Excitation: Pasa el vector por un cuello de botella denso (FC-ReLU-FC-Sigmoid) para generar pesos de relevancia.</w:t>
+        <w:br/>
+        <w:t>3. Recalibration: Multiplica los canales originales por los pesos de atención calculados, permitiendo a la red amplificar rasgos faciales críticos (como comisuras de labios o arqueo de cejas) y atenuar ruido de fondo.</w:t>
       </w:r>
     </w:p>
     <w:p>
@@ -2641,7 +1659,7 @@
           <w:color w:val="004C99"/>
           <w:sz w:val="26"/>
         </w:rPr>
-        <w:t>3.3. Redes Neuronales Convolucionales (CNN)</w:t>
+        <w:t>3.3. Detección Facial Neuronal YuNet vs. Haar Cascade</w:t>
       </w:r>
     </w:p>
     <w:p>
@@ -2658,11 +1676,7 @@
           <w:color w:val="1E1E1E"/>
           <w:sz w:val="22"/>
         </w:rPr>
-        <w:t>Las CNNs se fundamentan en dos principios clave de diseño que las hacen idóneas para imágenes:</w:t>
-        <w:br/>
-        <w:t>1. Conectividad Local: Las neuronas convolucionales procesan únicamente campos receptivos restringidos, preservando la correlación espacial de los píxeles contiguos.</w:t>
-        <w:br/>
-        <w:t>2. Pesos Compartidos: Los mismos filtros (kernels) se aplican a lo largo de toda la imagen, garantizando invarianza a la traslación y reduciendo exponencialmente la cantidad de parámetros frente a redes densas.</w:t>
+        <w:t>A diferencia del algoritmo clásico de Haar Cascade (2001) basado en características manuales rígidas que solo detectan caras frontales y producen falsos positivos en ropa/fondos, YuNet es un detector neuronal basado en redes convolucionales ligeras (ONNX). YuNet es capaz de localizar rostros en perfiles de hasta ±90° de giro (yaw), inclinación (roll) y cabeceo (pitch), detectando adicionalmente 5 puntos clave faciales (ojos, nariz y boca).</w:t>
       </w:r>
     </w:p>
     <w:p>
@@ -2677,148 +1691,7 @@
           <w:color w:val="004C99"/>
           <w:sz w:val="26"/>
         </w:rPr>
-        <w:t>3.4. Componentes y Bloques de la Arquitectura</w:t>
-      </w:r>
-    </w:p>
-    <w:p>
-      <w:pPr>
-        <w:spacing w:after="80"/>
-      </w:pPr>
-      <w:r>
-        <w:rPr>
-          <w:b/>
-          <w:sz w:val="21"/>
-        </w:rPr>
-        <w:t xml:space="preserve">•  Convolución 2D (Conv2D): </w:t>
-      </w:r>
-      <w:r>
-        <w:rPr>
-          <w:sz w:val="21"/>
-        </w:rPr>
-        <w:t>Aplica una operación de convolución discreta con kernels de 3×3 para extraer mapas de características.</w:t>
-      </w:r>
-    </w:p>
-    <w:p>
-      <w:pPr>
-        <w:spacing w:after="80"/>
-      </w:pPr>
-      <w:r>
-        <w:rPr>
-          <w:b/>
-          <w:sz w:val="21"/>
-        </w:rPr>
-        <w:t xml:space="preserve">•  Batch Normalization (BatchNorm): </w:t>
-      </w:r>
-      <w:r>
-        <w:rPr>
-          <w:sz w:val="21"/>
-        </w:rPr>
-        <w:t>Estandariza las salidas de cada capa restando la media y dividiendo por la desviación estándar del mini-lote, acelerando la convergencia y permitiendo mayores tasas de aprendizaje.</w:t>
-      </w:r>
-    </w:p>
-    <w:p>
-      <w:pPr>
-        <w:spacing w:after="80"/>
-      </w:pPr>
-      <w:r>
-        <w:rPr>
-          <w:b/>
-          <w:sz w:val="21"/>
-        </w:rPr>
-        <w:t xml:space="preserve">•  Unidad Lineal Rectificada (ReLU): </w:t>
-      </w:r>
-      <w:r>
-        <w:rPr>
-          <w:sz w:val="21"/>
-        </w:rPr>
-        <w:t>Función no lineal f(x) = max(0, x) que soluciona el problema del desvanecimiento del gradiente (*vanishing gradient*).</w:t>
-      </w:r>
-    </w:p>
-    <w:p>
-      <w:pPr>
-        <w:spacing w:after="80"/>
-      </w:pPr>
-      <w:r>
-        <w:rPr>
-          <w:b/>
-          <w:sz w:val="21"/>
-        </w:rPr>
-        <w:t xml:space="preserve">•  Max Pooling: </w:t>
-      </w:r>
-      <w:r>
-        <w:rPr>
-          <w:sz w:val="21"/>
-        </w:rPr>
-        <w:t>Reduce el tamaño espacial de los mapas tomando el valor máximo en ventanas de 2×2 con paso (stride) 2, confiriendo robustez ante pequeñas deformaciones.</w:t>
-      </w:r>
-    </w:p>
-    <w:p>
-      <w:pPr>
-        <w:spacing w:after="80"/>
-      </w:pPr>
-      <w:r>
-        <w:rPr>
-          <w:b/>
-          <w:sz w:val="21"/>
-        </w:rPr>
-        <w:t xml:space="preserve">•  Dropout: </w:t>
-      </w:r>
-      <w:r>
-        <w:rPr>
-          <w:sz w:val="21"/>
-        </w:rPr>
-        <w:t>Desactiva aleatoriamente neuronas con cierta probabilidad p durante el forward pass para prevenir la co-adaptación de rasgos y combatir el overfitting.</w:t>
-      </w:r>
-    </w:p>
-    <w:p>
-      <w:pPr>
-        <w:spacing w:after="80"/>
-      </w:pPr>
-      <w:r>
-        <w:rPr>
-          <w:b/>
-          <w:sz w:val="21"/>
-        </w:rPr>
-        <w:t xml:space="preserve">•  Capas Totalmente Conectadas (Dense/FC): </w:t>
-      </w:r>
-      <w:r>
-        <w:rPr>
-          <w:sz w:val="21"/>
-        </w:rPr>
-        <w:t>Transforman los mapas de características aplanados en el espacio latente de decisión para la predicción de clases.</w:t>
-      </w:r>
-    </w:p>
-    <w:p>
-      <w:pPr>
-        <w:spacing w:after="80"/>
-      </w:pPr>
-      <w:r>
-        <w:rPr>
-          <w:b/>
-          <w:sz w:val="21"/>
-        </w:rPr>
-        <w:t xml:space="preserve">•  Softmax: </w:t>
-      </w:r>
-      <w:r>
-        <w:rPr>
-          <w:sz w:val="21"/>
-        </w:rPr>
-        <w:t>Función logística multivariable que normaliza los logits de salida en una distribución de probabilidad que suma 1.0.</w:t>
-      </w:r>
-    </w:p>
-    <w:p>
-      <w:pPr>
-        <w:pStyle w:val="Heading2"/>
-        <w:spacing w:before="200" w:after="80"/>
-      </w:pPr>
-      <w:r>
-        <w:rPr>
-          <w:rFonts w:ascii="Calibri" w:hAnsi="Calibri"/>
-          <w:b/>
-          <w:color w:val="004C99"/>
-          <w:sz w:val="26"/>
-        </w:rPr>
-        <w:t>3.5. Aceleración por GPU y Cómputo Paralelo CUDA</w:t>
+        <w:t>3.4. Ecosistema de Exportación Abierta: ONNX y OpenCV DNN</w:t>
       </w:r>
     </w:p>
     <w:p>
@@ -2835,7 +1708,7 @@
           <w:color w:val="1E1E1E"/>
           <w:sz w:val="22"/>
         </w:rPr>
-        <w:t>El entrenamiento de modelos convolucionales involucra billones de operaciones de multiplicación de matrices (GEMM) y convoluciones tensoriales. La tecnología NVIDIA CUDA permite paralelizar estos cálculos masivos en miles de núcleos de la GPU (RTX 5060 Ti), alcanzando aceleraciones de hasta 20x a 30x en comparación con ejecuciones convencionales sobre procesadores multinúcleo (CPU).</w:t>
+        <w:t>El formato ONNX (Open Neural Network Exchange) estandariza la representación de grafos computacionales de redes neuronales. Permite desacoplar el entorno de entrenamiento (PyTorch con CUDA de 3+ GB) del entorno de inferencia, haciendo posible ejecutar la red neuronal con el motor OpenCV Deep Neural Network (DNN) en C++ o Python puro, con requerimientos de memoria inferiores a 50 MB y compatibilidad multiplataforma en cualquier procesador CPU.</w:t>
       </w:r>
     </w:p>
     <w:p>
@@ -2855,7 +1728,7 @@
           <w:color w:val="003366"/>
           <w:sz w:val="30"/>
         </w:rPr>
-        <w:t>4. DATASET FER2013 Y PREPROCESAMIENTO</w:t>
+        <w:t>4. DATASET FER2013 Y AUDITORÍA DE DATOS</w:t>
       </w:r>
     </w:p>
     <w:p>
@@ -2872,22 +1745,7 @@
           <w:color w:val="1E1E1E"/>
           <w:sz w:val="22"/>
         </w:rPr>
-        <w:t>El conjunto de datos FER2013 (Facial Expression Recognition 2013) es un estándar en la literatura científica compuesto por 35,887 imágenes en escala de grises de 48×48 píxeles con rostros centrados en diversas condiciones del mundo real (iluminación variable, rotaciones leves, expresiones sutiles y marcadas).</w:t>
-      </w:r>
-    </w:p>
-    <w:p>
-      <w:pPr>
-        <w:pStyle w:val="Heading2"/>
-        <w:spacing w:before="200" w:after="80"/>
-      </w:pPr>
-      <w:r>
-        <w:rPr>
-          <w:rFonts w:ascii="Calibri" w:hAnsi="Calibri"/>
-          <w:b/>
-          <w:color w:val="004C99"/>
-          <w:sz w:val="26"/>
-        </w:rPr>
-        <w:t>4.1. Distribución de Muestras y Clases</w:t>
+        <w:t>El dataset FER2013 contiene 35,887 imágenes en escala de grises de 48×48 píxeles. Presenta desafíos significativos debido a la ambigüedad humana de ciertas etiquetas y un fuerte desbalance de clases:</w:t>
       </w:r>
     </w:p>
     <w:tbl>
@@ -4111,7 +2969,7 @@
           <w:color w:val="004C99"/>
           <w:sz w:val="26"/>
         </w:rPr>
-        <w:t>4.2. Desbalance de Clases y Data Augmentation</w:t>
+        <w:t>4.1. Auditoría de Partición y Cero Fuga de Datos (Zero Data Leakage)</w:t>
       </w:r>
     </w:p>
     <w:p>
@@ -4128,97 +2986,47 @@
           <w:color w:val="1E1E1E"/>
           <w:sz w:val="22"/>
         </w:rPr>
-        <w:t>Como se aprecia en la tabla anterior, existe un desbalance inherente: la clase 'Feliz' concentra el 25% de los datos, mientras que 'Disgusto' apenas cuenta con 547 muestras (1.52%). Para contrarrestar esta disparidad y prevenir que la red memorice patrones sin generalizar, se diseñó un pipeline de Data Augmentation en tiempo de ejecución utilizando Torchvision Transforms:</w:t>
+        <w:t>Para asegurar una validez científica inobjetable, se verificó el estricto aislamiento de los conjuntos:</w:t>
+        <w:br/>
+        <w:t>•  Conjunto de Entrenamiento (24,403 imágenes - 85% de Train): Único conjunto utilizado para actualizar gradientes y calcular los pesos de clase (*Class Weights*).</w:t>
+        <w:br/>
+        <w:t>•  Conjunto de Validación (4,306 imágenes - 15% de Train): Utilizado exclusivamente para monitorear la pérdida en cada época y activar Early Stopping.</w:t>
+        <w:br/>
+        <w:t>•  Conjunto de Prueba / Test (7,178 imágenes): Totalmente aislado en la partición 'test/', evaluado únicamente al finalizar el entrenamiento.</w:t>
+        <w:br/>
+        <w:t>•  Aislamiento del Data Augmentation: El generador estocástico (*RandomCrop*, *Flip*, *RandomErasing*) opera únicamente sobre el conjunto de entrenamiento (is_train=True), mientras que validación y test aplican una transformación determinista fija.</w:t>
       </w:r>
     </w:p>
     <w:p>
       <w:pPr>
-        <w:spacing w:after="60"/>
+        <w:pStyle w:val="Heading2"/>
+        <w:spacing w:before="200" w:after="80"/>
       </w:pPr>
       <w:r>
         <w:rPr>
+          <w:rFonts w:ascii="Calibri" w:hAnsi="Calibri"/>
           <w:b/>
-          <w:sz w:val="21"/>
+          <w:color w:val="004C99"/>
+          <w:sz w:val="26"/>
         </w:rPr>
-        <w:t xml:space="preserve">•  Inversión horizontal aleatoria (*Random Horizontal Flip*): </w:t>
-      </w:r>
-      <w:r>
-        <w:rPr>
-          <w:sz w:val="21"/>
-        </w:rPr>
-        <w:t>Probabilidad del 50% para simular simetría facial.</w:t>
+        <w:t>4.2. Carga y Procesamiento Directo en VRAM de la GPU</w:t>
       </w:r>
     </w:p>
     <w:p>
       <w:pPr>
-        <w:spacing w:after="60"/>
+        <w:spacing w:after="120" w:line="276" w:lineRule="auto"/>
+        <w:ind w:firstLine="454"/>
+        <w:jc w:val="both"/>
       </w:pPr>
       <w:r>
         <w:rPr>
-          <w:b/>
-          <w:sz w:val="21"/>
+          <w:rFonts w:ascii="Calibri" w:hAnsi="Calibri"/>
+          <w:b w:val="0"/>
+          <w:i w:val="0"/>
+          <w:color w:val="1E1E1E"/>
+          <w:sz w:val="22"/>
         </w:rPr>
-        <w:t xml:space="preserve">•  Rotación aleatoria (*Random Rotation*): </w:t>
-      </w:r>
-      <w:r>
-        <w:rPr>
-          <w:sz w:val="21"/>
-        </w:rPr>
-        <w:t>Variación angular de hasta ±10° simulando inclinaciones de cabeza.</w:t>
-      </w:r>
-    </w:p>
-    <w:p>
-      <w:pPr>
-        <w:spacing w:after="60"/>
-      </w:pPr>
-      <w:r>
-        <w:rPr>
-          <w:b/>
-          <w:sz w:val="21"/>
-        </w:rPr>
-        <w:t xml:space="preserve">•  Traslación afín (*Random Affine Translation*): </w:t>
-      </w:r>
-      <w:r>
-        <w:rPr>
-          <w:sz w:val="21"/>
-        </w:rPr>
-        <w:t>Desplazamiento horizontal y vertical de hasta 10%.</w:t>
-      </w:r>
-    </w:p>
-    <w:p>
-      <w:pPr>
-        <w:spacing w:after="60"/>
-      </w:pPr>
-      <w:r>
-        <w:rPr>
-          <w:b/>
-          <w:sz w:val="21"/>
-        </w:rPr>
-        <w:t xml:space="preserve">•  Ajuste de contraste y brillo (*ColorJitter*): </w:t>
-      </w:r>
-      <w:r>
-        <w:rPr>
-          <w:sz w:val="21"/>
-        </w:rPr>
-        <w:t>Perturbación aleatoria de ±20% en escala de grises.</w:t>
-      </w:r>
-    </w:p>
-    <w:p>
-      <w:pPr>
-        <w:spacing w:after="60"/>
-      </w:pPr>
-      <w:r>
-        <w:rPr>
-          <w:b/>
-          <w:sz w:val="21"/>
-        </w:rPr>
-        <w:t xml:space="preserve">•  Normalización estadística: </w:t>
-      </w:r>
-      <w:r>
-        <w:rPr>
-          <w:sz w:val="21"/>
-        </w:rPr>
-        <w:t>Escalamiento al rango [-1.0, 1.0] con media 0.5 y desviación estándar 0.5.</w:t>
+        <w:t>En lugar de cargar imágenes lote por lote desde el disco o la RAM de la CPU, las 35,887 imágenes se transfieren como tensores uint8 directamente a la memoria VRAM de la GPU (78.9 MB totales, representando solo el 0.5% de los 16 GB de la RTX 5060 Ti). Esto elimina al 100% los cuellos de botella del bus PCIe y la sobrecarga de subprocesos en Windows.</w:t>
       </w:r>
     </w:p>
     <w:p>
@@ -4238,7 +3046,22 @@
           <w:color w:val="003366"/>
           <w:sz w:val="30"/>
         </w:rPr>
-        <w:t>5. ARQUITECTURA DEL MODELO EMOTIONCNN</w:t>
+        <w:t>5. ARQUITECTURA DE LOS MODELOS IMPLEMENTADOS</w:t>
+      </w:r>
+    </w:p>
+    <w:p>
+      <w:pPr>
+        <w:pStyle w:val="Heading2"/>
+        <w:spacing w:before="200" w:after="80"/>
+      </w:pPr>
+      <w:r>
+        <w:rPr>
+          <w:rFonts w:ascii="Calibri" w:hAnsi="Calibri"/>
+          <w:b/>
+          <w:color w:val="004C99"/>
+          <w:sz w:val="26"/>
+        </w:rPr>
+        <w:t>5.1. Arquitectura Avanzada: EmotionResNetSE (11.38M Parámetros)</w:t>
       </w:r>
     </w:p>
     <w:p>
@@ -4255,7 +3078,7 @@
           <w:color w:val="1E1E1E"/>
           <w:sz w:val="22"/>
         </w:rPr>
-        <w:t>La arquitectura EmotionCNN fue construida en PyTorch con un diseño modular en bloques convolucionales dobles (*VGG-like style*), totalizando 2,488,423 parámetros entrenables. La secuencia de transformaciones reduce progresivamente la resolución espacial mientras incrementa la profundidad de los mapas de canales:</w:t>
+        <w:t>EmotionResNetSE es la arquitectura principal optimizada para expresiones sutiles. Combina 4 etapas residuales con atención Squeeze-and-Excitation y Global Average Pooling:</w:t>
       </w:r>
     </w:p>
     <w:tbl>
@@ -4404,7 +3227,7 @@
                 <w:color w:val="282828"/>
                 <w:sz w:val="19"/>
               </w:rPr>
-              <w:t>Entrada</w:t>
+              <w:t>Stem Inicial</w:t>
             </w:r>
           </w:p>
         </w:tc>
@@ -4430,7 +3253,7 @@
                 <w:color w:val="282828"/>
                 <w:sz w:val="19"/>
               </w:rPr>
-              <w:t>Tensor (1, 48, 48)</w:t>
+              <w:t>Conv2D(1 → 64, k=3, p=1) + BatchNorm + ReLU</w:t>
             </w:r>
           </w:p>
         </w:tc>
@@ -4456,7 +3279,7 @@
                 <w:color w:val="282828"/>
                 <w:sz w:val="19"/>
               </w:rPr>
-              <w:t>Imagen en escala de grises normalizada</w:t>
+              <w:t>Tensor (64, 48, 48)</w:t>
             </w:r>
           </w:p>
         </w:tc>
@@ -4482,7 +3305,7 @@
                 <w:color w:val="282828"/>
                 <w:sz w:val="19"/>
               </w:rPr>
-              <w:t>-</w:t>
+              <w:t>704</w:t>
             </w:r>
           </w:p>
         </w:tc>
@@ -4510,7 +3333,7 @@
                 <w:color w:val="282828"/>
                 <w:sz w:val="19"/>
               </w:rPr>
-              <w:t>Bloque Conv 1</w:t>
+              <w:t>Etapa 1 (Stage 1)</w:t>
             </w:r>
           </w:p>
         </w:tc>
@@ -4536,7 +3359,7 @@
                 <w:color w:val="282828"/>
                 <w:sz w:val="19"/>
               </w:rPr>
-              <w:t>2x Conv2D(32, k=3) + BatchNorm + ReLU + MaxPool(2x2) + Dropout(0.25)</w:t>
+              <w:t>2x ResidualSEBlock(64 → 64) + SE-Attention + Dropout(0.1)</w:t>
             </w:r>
           </w:p>
         </w:tc>
@@ -4562,7 +3385,7 @@
                 <w:color w:val="282828"/>
                 <w:sz w:val="19"/>
               </w:rPr>
-              <w:t>Tensor (32, 24, 24)</w:t>
+              <w:t>Tensor (64, 48, 48)</w:t>
             </w:r>
           </w:p>
         </w:tc>
@@ -4588,7 +3411,7 @@
                 <w:color w:val="282828"/>
                 <w:sz w:val="19"/>
               </w:rPr>
-              <w:t>9,568</w:t>
+              <w:t>150,016</w:t>
             </w:r>
           </w:p>
         </w:tc>
@@ -4616,7 +3439,7 @@
                 <w:color w:val="282828"/>
                 <w:sz w:val="19"/>
               </w:rPr>
-              <w:t>Bloque Conv 2</w:t>
+              <w:t>Etapa 2 (Stage 2)</w:t>
             </w:r>
           </w:p>
         </w:tc>
@@ -4642,7 +3465,7 @@
                 <w:color w:val="282828"/>
                 <w:sz w:val="19"/>
               </w:rPr>
-              <w:t>2x Conv2D(64, k=3) + BatchNorm + ReLU + MaxPool(2x2) + Dropout(0.25)</w:t>
+              <w:t>2x ResidualSEBlock(64 → 128, s=2) + SE-Attention + Dropout(0.15)</w:t>
             </w:r>
           </w:p>
         </w:tc>
@@ -4668,7 +3491,7 @@
                 <w:color w:val="282828"/>
                 <w:sz w:val="19"/>
               </w:rPr>
-              <w:t>Tensor (64, 12, 12)</w:t>
+              <w:t>Tensor (128, 24, 24)</w:t>
             </w:r>
           </w:p>
         </w:tc>
@@ -4694,7 +3517,7 @@
                 <w:color w:val="282828"/>
                 <w:sz w:val="19"/>
               </w:rPr>
-              <w:t>55,424</w:t>
+              <w:t>529,664</w:t>
             </w:r>
           </w:p>
         </w:tc>
@@ -4722,7 +3545,7 @@
                 <w:color w:val="282828"/>
                 <w:sz w:val="19"/>
               </w:rPr>
-              <w:t>Bloque Conv 3</w:t>
+              <w:t>Etapa 3 (Stage 3)</w:t>
             </w:r>
           </w:p>
         </w:tc>
@@ -4748,7 +3571,7 @@
                 <w:color w:val="282828"/>
                 <w:sz w:val="19"/>
               </w:rPr>
-              <w:t>2x Conv2D(128, k=3) + BatchNorm + ReLU + MaxPool(2x2) + Dropout(0.25)</w:t>
+              <w:t>2x ResidualSEBlock(128 → 256, s=2) + SE-Attention + Dropout(0.2)</w:t>
             </w:r>
           </w:p>
         </w:tc>
@@ -4774,7 +3597,7 @@
                 <w:color w:val="282828"/>
                 <w:sz w:val="19"/>
               </w:rPr>
-              <w:t>Tensor (128, 6, 6)</w:t>
+              <w:t>Tensor (256, 12, 12)</w:t>
             </w:r>
           </w:p>
         </w:tc>
@@ -4800,7 +3623,7 @@
                 <w:color w:val="282828"/>
                 <w:sz w:val="19"/>
               </w:rPr>
-              <w:t>221,440</w:t>
+              <w:t>2,116,096</w:t>
             </w:r>
           </w:p>
         </w:tc>
@@ -4828,7 +3651,7 @@
                 <w:color w:val="282828"/>
                 <w:sz w:val="19"/>
               </w:rPr>
-              <w:t>Bloque Conv 4</w:t>
+              <w:t>Etapa 4 (Stage 4)</w:t>
             </w:r>
           </w:p>
         </w:tc>
@@ -4854,7 +3677,7 @@
                 <w:color w:val="282828"/>
                 <w:sz w:val="19"/>
               </w:rPr>
-              <w:t>2x Conv2D(256, k=3) + BatchNorm + ReLU + MaxPool(2x2) + Dropout(0.25)</w:t>
+              <w:t>2x ResidualSEBlock(256 → 512, s=2) + SE-Attention + Dropout(0.25)</w:t>
             </w:r>
           </w:p>
         </w:tc>
@@ -4880,7 +3703,7 @@
                 <w:color w:val="282828"/>
                 <w:sz w:val="19"/>
               </w:rPr>
-              <w:t>Tensor (256, 3, 3)</w:t>
+              <w:t>Tensor (512, 6, 6)</w:t>
             </w:r>
           </w:p>
         </w:tc>
@@ -4906,7 +3729,7 @@
                 <w:color w:val="282828"/>
                 <w:sz w:val="19"/>
               </w:rPr>
-              <w:t>885,248</w:t>
+              <w:t>8,459,264</w:t>
             </w:r>
           </w:p>
         </w:tc>
@@ -4934,7 +3757,7 @@
                 <w:color w:val="282828"/>
                 <w:sz w:val="19"/>
               </w:rPr>
-              <w:t>Flatten</w:t>
+              <w:t>Global Avg Pool (GAP)</w:t>
             </w:r>
           </w:p>
         </w:tc>
@@ -4960,7 +3783,7 @@
                 <w:color w:val="282828"/>
                 <w:sz w:val="19"/>
               </w:rPr>
-              <w:t>Aplanamiento tensorial 256 x 3 x 3</w:t>
+              <w:t>AdaptiveAvgPool2D(1, 1) + Flatten</w:t>
             </w:r>
           </w:p>
         </w:tc>
@@ -4986,7 +3809,7 @@
                 <w:color w:val="282828"/>
                 <w:sz w:val="19"/>
               </w:rPr>
-              <w:t>Vector (2304)</w:t>
+              <w:t>Vector (512)</w:t>
             </w:r>
           </w:p>
         </w:tc>
@@ -5040,7 +3863,7 @@
                 <w:color w:val="282828"/>
                 <w:sz w:val="19"/>
               </w:rPr>
-              <w:t>Densa FC 1</w:t>
+              <w:t>Clasificador Denso</w:t>
             </w:r>
           </w:p>
         </w:tc>
@@ -5066,219 +3889,7 @@
                 <w:color w:val="282828"/>
                 <w:sz w:val="19"/>
               </w:rPr>
-              <w:t>Linear(2304 → 512) + BatchNorm1D + ReLU + Dropout(0.5)</w:t>
-            </w:r>
-          </w:p>
-        </w:tc>
-        <w:tc>
-          <w:tcPr>
-            <w:tcW w:type="dxa" w:w="2280"/>
-            <w:shd w:fill="FFFFFF"/>
-            <w:tcMar>
-              <w:top w:w="80" w:type="dxa"/>
-              <w:bottom w:w="80" w:type="dxa"/>
-              <w:left w:w="120" w:type="dxa"/>
-              <w:right w:w="120" w:type="dxa"/>
-            </w:tcMar>
-            <w:vAlign w:val="center"/>
-          </w:tcPr>
-          <w:p>
-            <w:pPr>
-              <w:jc w:val="center"/>
-            </w:pPr>
-            <w:r>
-              <w:rPr>
-                <w:rFonts w:ascii="Calibri" w:hAnsi="Calibri"/>
-                <w:color w:val="282828"/>
-                <w:sz w:val="19"/>
-              </w:rPr>
-              <w:t>Vector (512)</w:t>
-            </w:r>
-          </w:p>
-        </w:tc>
-        <w:tc>
-          <w:tcPr>
-            <w:tcW w:type="dxa" w:w="2280"/>
-            <w:shd w:fill="FFFFFF"/>
-            <w:tcMar>
-              <w:top w:w="80" w:type="dxa"/>
-              <w:bottom w:w="80" w:type="dxa"/>
-              <w:left w:w="120" w:type="dxa"/>
-              <w:right w:w="120" w:type="dxa"/>
-            </w:tcMar>
-            <w:vAlign w:val="center"/>
-          </w:tcPr>
-          <w:p>
-            <w:pPr>
-              <w:jc w:val="center"/>
-            </w:pPr>
-            <w:r>
-              <w:rPr>
-                <w:rFonts w:ascii="Calibri" w:hAnsi="Calibri"/>
-                <w:color w:val="282828"/>
-                <w:sz w:val="19"/>
-              </w:rPr>
-              <w:t>1,180,160</w:t>
-            </w:r>
-          </w:p>
-        </w:tc>
-      </w:tr>
-      <w:tr>
-        <w:tc>
-          <w:tcPr>
-            <w:tcW w:type="dxa" w:w="2280"/>
-            <w:shd w:fill="F4F6F9"/>
-            <w:tcMar>
-              <w:top w:w="80" w:type="dxa"/>
-              <w:bottom w:w="80" w:type="dxa"/>
-              <w:left w:w="120" w:type="dxa"/>
-              <w:right w:w="120" w:type="dxa"/>
-            </w:tcMar>
-            <w:vAlign w:val="center"/>
-          </w:tcPr>
-          <w:p>
-            <w:pPr>
-              <w:jc w:val="center"/>
-            </w:pPr>
-            <w:r>
-              <w:rPr>
-                <w:rFonts w:ascii="Calibri" w:hAnsi="Calibri"/>
-                <w:color w:val="282828"/>
-                <w:sz w:val="19"/>
-              </w:rPr>
-              <w:t>Densa FC 2</w:t>
-            </w:r>
-          </w:p>
-        </w:tc>
-        <w:tc>
-          <w:tcPr>
-            <w:tcW w:type="dxa" w:w="2280"/>
-            <w:shd w:fill="F4F6F9"/>
-            <w:tcMar>
-              <w:top w:w="80" w:type="dxa"/>
-              <w:bottom w:w="80" w:type="dxa"/>
-              <w:left w:w="120" w:type="dxa"/>
-              <w:right w:w="120" w:type="dxa"/>
-            </w:tcMar>
-            <w:vAlign w:val="center"/>
-          </w:tcPr>
-          <w:p>
-            <w:pPr>
-              <w:jc w:val="left"/>
-            </w:pPr>
-            <w:r>
-              <w:rPr>
-                <w:rFonts w:ascii="Calibri" w:hAnsi="Calibri"/>
-                <w:color w:val="282828"/>
-                <w:sz w:val="19"/>
-              </w:rPr>
-              <w:t>Linear(512 → 256) + BatchNorm1D + ReLU + Dropout(0.5)</w:t>
-            </w:r>
-          </w:p>
-        </w:tc>
-        <w:tc>
-          <w:tcPr>
-            <w:tcW w:type="dxa" w:w="2280"/>
-            <w:shd w:fill="F4F6F9"/>
-            <w:tcMar>
-              <w:top w:w="80" w:type="dxa"/>
-              <w:bottom w:w="80" w:type="dxa"/>
-              <w:left w:w="120" w:type="dxa"/>
-              <w:right w:w="120" w:type="dxa"/>
-            </w:tcMar>
-            <w:vAlign w:val="center"/>
-          </w:tcPr>
-          <w:p>
-            <w:pPr>
-              <w:jc w:val="center"/>
-            </w:pPr>
-            <w:r>
-              <w:rPr>
-                <w:rFonts w:ascii="Calibri" w:hAnsi="Calibri"/>
-                <w:color w:val="282828"/>
-                <w:sz w:val="19"/>
-              </w:rPr>
-              <w:t>Vector (256)</w:t>
-            </w:r>
-          </w:p>
-        </w:tc>
-        <w:tc>
-          <w:tcPr>
-            <w:tcW w:type="dxa" w:w="2280"/>
-            <w:shd w:fill="F4F6F9"/>
-            <w:tcMar>
-              <w:top w:w="80" w:type="dxa"/>
-              <w:bottom w:w="80" w:type="dxa"/>
-              <w:left w:w="120" w:type="dxa"/>
-              <w:right w:w="120" w:type="dxa"/>
-            </w:tcMar>
-            <w:vAlign w:val="center"/>
-          </w:tcPr>
-          <w:p>
-            <w:pPr>
-              <w:jc w:val="center"/>
-            </w:pPr>
-            <w:r>
-              <w:rPr>
-                <w:rFonts w:ascii="Calibri" w:hAnsi="Calibri"/>
-                <w:color w:val="282828"/>
-                <w:sz w:val="19"/>
-              </w:rPr>
-              <w:t>131,328</w:t>
-            </w:r>
-          </w:p>
-        </w:tc>
-      </w:tr>
-      <w:tr>
-        <w:tc>
-          <w:tcPr>
-            <w:tcW w:type="dxa" w:w="2280"/>
-            <w:shd w:fill="FFFFFF"/>
-            <w:tcMar>
-              <w:top w:w="80" w:type="dxa"/>
-              <w:bottom w:w="80" w:type="dxa"/>
-              <w:left w:w="120" w:type="dxa"/>
-              <w:right w:w="120" w:type="dxa"/>
-            </w:tcMar>
-            <w:vAlign w:val="center"/>
-          </w:tcPr>
-          <w:p>
-            <w:pPr>
-              <w:jc w:val="center"/>
-            </w:pPr>
-            <w:r>
-              <w:rPr>
-                <w:rFonts w:ascii="Calibri" w:hAnsi="Calibri"/>
-                <w:color w:val="282828"/>
-                <w:sz w:val="19"/>
-              </w:rPr>
-              <w:t>Salida FC 3</w:t>
-            </w:r>
-          </w:p>
-        </w:tc>
-        <w:tc>
-          <w:tcPr>
-            <w:tcW w:type="dxa" w:w="2280"/>
-            <w:shd w:fill="FFFFFF"/>
-            <w:tcMar>
-              <w:top w:w="80" w:type="dxa"/>
-              <w:bottom w:w="80" w:type="dxa"/>
-              <w:left w:w="120" w:type="dxa"/>
-              <w:right w:w="120" w:type="dxa"/>
-            </w:tcMar>
-            <w:vAlign w:val="center"/>
-          </w:tcPr>
-          <w:p>
-            <w:pPr>
-              <w:jc w:val="left"/>
-            </w:pPr>
-            <w:r>
-              <w:rPr>
-                <w:rFonts w:ascii="Calibri" w:hAnsi="Calibri"/>
-                <w:color w:val="282828"/>
-                <w:sz w:val="19"/>
-              </w:rPr>
-              <w:t>Linear(256 → 7)</w:t>
+              <w:t>Dropout(0.4) + Linear(512→256) + BN1D + ReLU + Dropout(0.3) + Linear(256→7)</w:t>
             </w:r>
           </w:p>
         </w:tc>
@@ -5330,7 +3941,7 @@
                 <w:color w:val="282828"/>
                 <w:sz w:val="19"/>
               </w:rPr>
-              <w:t>1,799</w:t>
+              <w:t>133,639</w:t>
             </w:r>
           </w:p>
         </w:tc>
@@ -5384,7 +3995,7 @@
                 <w:color w:val="282828"/>
                 <w:sz w:val="19"/>
               </w:rPr>
-              <w:t>Arquitectura Completa EmotionCNN</w:t>
+              <w:t>EmotionResNetSE (Residual + SE Attention)</w:t>
             </w:r>
           </w:p>
         </w:tc>
@@ -5436,13 +4047,45 @@
                 <w:color w:val="282828"/>
                 <w:sz w:val="19"/>
               </w:rPr>
-              <w:t>2,488,423</w:t>
+              <w:t>11,389,383</w:t>
             </w:r>
           </w:p>
         </w:tc>
       </w:tr>
     </w:tbl>
     <w:p/>
+    <w:p>
+      <w:pPr>
+        <w:pStyle w:val="Heading2"/>
+        <w:spacing w:before="200" w:after="80"/>
+      </w:pPr>
+      <w:r>
+        <w:rPr>
+          <w:rFonts w:ascii="Calibri" w:hAnsi="Calibri"/>
+          <w:b/>
+          <w:color w:val="004C99"/>
+          <w:sz w:val="26"/>
+        </w:rPr>
+        <w:t>5.2. Arquitectura Clásica: EmotionCNN (2.48M Parámetros)</w:t>
+      </w:r>
+    </w:p>
+    <w:p>
+      <w:pPr>
+        <w:spacing w:after="120" w:line="276" w:lineRule="auto"/>
+        <w:ind w:firstLine="454"/>
+        <w:jc w:val="both"/>
+      </w:pPr>
+      <w:r>
+        <w:rPr>
+          <w:rFonts w:ascii="Calibri" w:hAnsi="Calibri"/>
+          <w:b w:val="0"/>
+          <w:i w:val="0"/>
+          <w:color w:val="1E1E1E"/>
+          <w:sz w:val="22"/>
+        </w:rPr>
+        <w:t>Se mantiene disponible la arquitectura secuencial de 4 bloques convolucionales dobles (VGG-style) con 2,488,423 parámetros para efectos comparativos y retrocompatibilidad.</w:t>
+      </w:r>
+    </w:p>
     <w:p>
       <w:r>
         <w:br w:type="page"/>
@@ -5460,7 +4103,7 @@
           <w:color w:val="003366"/>
           <w:sz w:val="30"/>
         </w:rPr>
-        <w:t>6. METODOLOGÍA EXPERIMENTAL Y ENTRENAMIENTO</w:t>
+        <w:t>6. METODOLOGÍA EXPERIMENTAL Y BALANCEO</w:t>
       </w:r>
     </w:p>
     <w:p>
@@ -5475,24 +4118,7 @@
           <w:color w:val="004C99"/>
           <w:sz w:val="26"/>
         </w:rPr>
-        <w:t>6.1. Configuración de Hiperparámetros</w:t>
-      </w:r>
-    </w:p>
-    <w:p>
-      <w:pPr>
-        <w:spacing w:after="120" w:line="276" w:lineRule="auto"/>
-        <w:ind w:firstLine="454"/>
-        <w:jc w:val="both"/>
-      </w:pPr>
-      <w:r>
-        <w:rPr>
-          <w:rFonts w:ascii="Calibri" w:hAnsi="Calibri"/>
-          <w:b w:val="0"/>
-          <w:i w:val="0"/>
-          <w:color w:val="1E1E1E"/>
-          <w:sz w:val="22"/>
-        </w:rPr>
-        <w:t>El entrenamiento se rige por un esquema de optimización estocástica adaptativa. A continuación se resumen los hiperparámetros establecidos en la configuración del proyecto:</w:t>
+        <w:t>6.1. Hiperparámetros y Optimización</w:t>
       </w:r>
     </w:p>
     <w:tbl>
@@ -5530,7 +4156,7 @@
                 <w:color w:val="FFFFFF"/>
                 <w:sz w:val="20"/>
               </w:rPr>
-              <w:t>Hiperparámetro / Recurso</w:t>
+              <w:t>Hiperparámetro / Mecanismo</w:t>
             </w:r>
           </w:p>
         </w:tc>
@@ -5557,7 +4183,7 @@
                 <w:color w:val="FFFFFF"/>
                 <w:sz w:val="20"/>
               </w:rPr>
-              <w:t>Especificación</w:t>
+              <w:t>Configuración Aplicada</w:t>
             </w:r>
           </w:p>
         </w:tc>
@@ -5585,7 +4211,7 @@
                 <w:color w:val="282828"/>
                 <w:sz w:val="19"/>
               </w:rPr>
-              <w:t>Tamaño de Lote (Batch Size)</w:t>
+              <w:t>Arquitectura Principal</w:t>
             </w:r>
           </w:p>
         </w:tc>
@@ -5611,7 +4237,7 @@
                 <w:color w:val="282828"/>
                 <w:sz w:val="19"/>
               </w:rPr>
-              <w:t>128 muestras</w:t>
+              <w:t>EmotionResNetSE (Residual + Squeeze-and-Excitation)</w:t>
             </w:r>
           </w:p>
         </w:tc>
@@ -5639,7 +4265,7 @@
                 <w:color w:val="282828"/>
                 <w:sz w:val="19"/>
               </w:rPr>
-              <w:t>Tasa de Aprendizaje Inicial (Learning Rate)</w:t>
+              <w:t>Tamaño de Lote (Batch Size)</w:t>
             </w:r>
           </w:p>
         </w:tc>
@@ -5665,7 +4291,7 @@
                 <w:color w:val="282828"/>
                 <w:sz w:val="19"/>
               </w:rPr>
-              <w:t>0.001</w:t>
+              <w:t>128 muestras por iteración</w:t>
             </w:r>
           </w:p>
         </w:tc>
@@ -5693,7 +4319,7 @@
                 <w:color w:val="282828"/>
                 <w:sz w:val="19"/>
               </w:rPr>
-              <w:t>Decaimiento de Pesos (Weight Decay L2)</w:t>
+              <w:t>Tasa de Aprendizaje Inicial</w:t>
             </w:r>
           </w:p>
         </w:tc>
@@ -5719,7 +4345,7 @@
                 <w:color w:val="282828"/>
                 <w:sz w:val="19"/>
               </w:rPr>
-              <w:t>0.0001 (1e-4)</w:t>
+              <w:t>0.001</w:t>
             </w:r>
           </w:p>
         </w:tc>
@@ -5773,7 +4399,7 @@
                 <w:color w:val="282828"/>
                 <w:sz w:val="19"/>
               </w:rPr>
-              <w:t>Adam (Adaptive Moment Estimation)</w:t>
+              <w:t>AdamW (Weight Decay L2 = 1e-4)</w:t>
             </w:r>
           </w:p>
         </w:tc>
@@ -5801,7 +4427,7 @@
                 <w:color w:val="282828"/>
                 <w:sz w:val="19"/>
               </w:rPr>
-              <w:t>Función de Pérdida (Loss Function)</w:t>
+              <w:t>Planificador (Scheduler)</w:t>
             </w:r>
           </w:p>
         </w:tc>
@@ -5827,7 +4453,7 @@
                 <w:color w:val="282828"/>
                 <w:sz w:val="19"/>
               </w:rPr>
-              <w:t>Cross-Entropy Loss (nn.CrossEntropyLoss)</w:t>
+              <w:t>CosineAnnealingLR (T_max=50, eta_min=1e-6)</w:t>
             </w:r>
           </w:p>
         </w:tc>
@@ -5855,7 +4481,7 @@
                 <w:color w:val="282828"/>
                 <w:sz w:val="19"/>
               </w:rPr>
-              <w:t>Planificador de Tasa (Scheduler)</w:t>
+              <w:t>Función de Pérdida</w:t>
             </w:r>
           </w:p>
         </w:tc>
@@ -5881,7 +4507,7 @@
                 <w:color w:val="282828"/>
                 <w:sz w:val="19"/>
               </w:rPr>
-              <w:t>ReduceLROnPlateau (factor=0.5, paciencia=5 épocas)</w:t>
+              <w:t>CrossEntropyLoss con Class Weights y Label Smoothing (0.05)</w:t>
             </w:r>
           </w:p>
         </w:tc>
@@ -5909,7 +4535,7 @@
                 <w:color w:val="282828"/>
                 <w:sz w:val="19"/>
               </w:rPr>
-              <w:t>Criterio de Parada Temprana (Early Stopping)</w:t>
+              <w:t>Aceleración de Precisión</w:t>
             </w:r>
           </w:p>
         </w:tc>
@@ -5935,7 +4561,7 @@
                 <w:color w:val="282828"/>
                 <w:sz w:val="19"/>
               </w:rPr>
-              <w:t>10 épocas consecutivas sin mejora en Val Loss</w:t>
+              <w:t>Automatic Mixed Precision (AMP / FP16 en CUDA)</w:t>
             </w:r>
           </w:p>
         </w:tc>
@@ -5963,7 +4589,7 @@
                 <w:color w:val="282828"/>
                 <w:sz w:val="19"/>
               </w:rPr>
-              <w:t>Hardware / Aceleración</w:t>
+              <w:t>Early Stopping</w:t>
             </w:r>
           </w:p>
         </w:tc>
@@ -5989,7 +4615,61 @@
                 <w:color w:val="282828"/>
                 <w:sz w:val="19"/>
               </w:rPr>
-              <w:t>NVIDIA GeForce RTX 5060 Ti 16GB (CUDA 12.8)</w:t>
+              <w:t>10 épocas de paciencia monitoreando Val Loss</w:t>
+            </w:r>
+          </w:p>
+        </w:tc>
+      </w:tr>
+      <w:tr>
+        <w:tc>
+          <w:tcPr>
+            <w:tcW w:type="dxa" w:w="4561"/>
+            <w:shd w:fill="FFFFFF"/>
+            <w:tcMar>
+              <w:top w:w="80" w:type="dxa"/>
+              <w:bottom w:w="80" w:type="dxa"/>
+              <w:left w:w="120" w:type="dxa"/>
+              <w:right w:w="120" w:type="dxa"/>
+            </w:tcMar>
+            <w:vAlign w:val="center"/>
+          </w:tcPr>
+          <w:p>
+            <w:pPr>
+              <w:jc w:val="center"/>
+            </w:pPr>
+            <w:r>
+              <w:rPr>
+                <w:rFonts w:ascii="Calibri" w:hAnsi="Calibri"/>
+                <w:color w:val="282828"/>
+                <w:sz w:val="19"/>
+              </w:rPr>
+              <w:t>Alojamiento de Datos</w:t>
+            </w:r>
+          </w:p>
+        </w:tc>
+        <w:tc>
+          <w:tcPr>
+            <w:tcW w:type="dxa" w:w="4561"/>
+            <w:shd w:fill="FFFFFF"/>
+            <w:tcMar>
+              <w:top w:w="80" w:type="dxa"/>
+              <w:bottom w:w="80" w:type="dxa"/>
+              <w:left w:w="120" w:type="dxa"/>
+              <w:right w:w="120" w:type="dxa"/>
+            </w:tcMar>
+            <w:vAlign w:val="center"/>
+          </w:tcPr>
+          <w:p>
+            <w:pPr>
+              <w:jc w:val="left"/>
+            </w:pPr>
+            <w:r>
+              <w:rPr>
+                <w:rFonts w:ascii="Calibri" w:hAnsi="Calibri"/>
+                <w:color w:val="282828"/>
+                <w:sz w:val="19"/>
+              </w:rPr>
+              <w:t>100% Residente en VRAM (FastGPUDataLoader en CUDA)</w:t>
             </w:r>
           </w:p>
         </w:tc>
@@ -6008,7 +4688,7 @@
           <w:color w:val="004C99"/>
           <w:sz w:val="26"/>
         </w:rPr>
-        <w:t>6.2. Estrategia de Validación y Prevención de Overfitting</w:t>
+        <w:t>6.2. Ponderación de Clases (Class Weights)</w:t>
       </w:r>
     </w:p>
     <w:p>
@@ -6025,13 +4705,7 @@
           <w:color w:val="1E1E1E"/>
           <w:sz w:val="22"/>
         </w:rPr>
-        <w:t>Para garantizar una evaluación rigurosa y no sesgada, el dataset se particionó en tres conjuntos disjuntos:</w:t>
-        <w:br/>
-        <w:t>•  Entrenamiento (24,403 imágenes): Empleado para la actualización de gradientes.</w:t>
-        <w:br/>
-        <w:t>•  Validación (4,306 imágenes): Evaluado al cierre de cada época para el ajuste del scheduler y Early Stopping.</w:t>
-        <w:br/>
-        <w:t>•  Prueba / Test (7,178 imágenes): Reservado exclusivamente para la inferencia y reporte final de métricas.</w:t>
+        <w:t>Para solucionar el desbalance entre la clase mayoritaria ('Feliz' con 6,126 en train) y la minoritaria ('Disgusto' con 377 en train), la función de pérdida calculó pesos inversos amortiguados: Disgusto=2.43, Sorprendido=0.91, Enojado=0.81, Miedo=0.80, Triste=0.74, Neutral=0.72 y Feliz=0.60. Esto forzó a la red a penalizar severamente los errores en emociones poco representadas.</w:t>
       </w:r>
     </w:p>
     <w:p>
@@ -6051,7 +4725,7 @@
           <w:color w:val="003366"/>
           <w:sz w:val="30"/>
         </w:rPr>
-        <w:t>7. RESULTADOS EXPERIMENTALES Y EVALUACIÓN</w:t>
+        <w:t>7. RESULTADOS EXPERIMENTALES Y EVALUACIÓN EN TEST</w:t>
       </w:r>
     </w:p>
     <w:p>
@@ -6068,7 +4742,7 @@
           <w:color w:val="1E1E1E"/>
           <w:sz w:val="22"/>
         </w:rPr>
-        <w:t>Tras completar el proceso de entrenamiento y optimización, se evaluó el desempeño del mejor punto de control (*checkpoint*) sobre las 7,178 imágenes del conjunto de test independiente. Las visualizaciones y métricas generadas por el sistema se presentan a continuación:</w:t>
+        <w:t>El entrenamiento completó 50 épocas en 13 minutos y 12 segundos sobre la GPU NVIDIA RTX 5060 Ti. El mejor punto de control (*best checkpoint*) se alcanzó en la Época 40 con un Validation Accuracy de 68.97% y un Validation Loss de 1.1286 (y mínimo de pérdida en época 36 de 1.1202). Tras ello, se evaluó formalmente sobre las 7,178 imágenes nunca vistas del conjunto de TEST independiente:</w:t>
       </w:r>
     </w:p>
     <w:p>
@@ -6083,30 +4757,10 @@
           <w:color w:val="004C99"/>
           <w:sz w:val="26"/>
         </w:rPr>
-        <w:t>7.1. Curvas de Aprendizaje (Loss y Accuracy)</w:t>
+        <w:t>7.1. Curvas de Aprendizaje e Historial de Entrenamiento</w:t>
       </w:r>
     </w:p>
     <w:p>
-      <w:pPr>
-        <w:spacing w:after="120" w:line="276" w:lineRule="auto"/>
-        <w:ind w:firstLine="454"/>
-        <w:jc w:val="both"/>
-      </w:pPr>
-      <w:r>
-        <w:rPr>
-          <w:rFonts w:ascii="Calibri" w:hAnsi="Calibri"/>
-          <w:b w:val="0"/>
-          <w:i w:val="0"/>
-          <w:color w:val="1E1E1E"/>
-          <w:sz w:val="22"/>
-        </w:rPr>
-        <w:t>La evolución de la pérdida (*Loss*) y la exactitud (*Accuracy*) tanto en el conjunto de entrenamiento como en validación refleja una convergencia estable gracias a la regularización por Dropout y Batch Normalization:</w:t>
-      </w:r>
-    </w:p>
-    <w:p>
-      <w:pPr>
-        <w:jc w:val="center"/>
-      </w:pPr>
       <w:r>
         <w:drawing>
           <wp:inline xmlns:a="http://schemas.openxmlformats.org/drawingml/2006/main" xmlns:pic="http://schemas.openxmlformats.org/drawingml/2006/picture">
@@ -6151,7 +4805,7 @@
           <w:i/>
           <w:sz w:val="19"/>
         </w:rPr>
-        <w:t>Figura 1: Curvas de Pérdida (Loss) y Precisión (Accuracy) por Época de Entrenamiento.</w:t>
+        <w:t>Figura 1: Curvas de Pérdida (Loss) y Precisión (Accuracy) del modelo EmotionResNetSE.</w:t>
       </w:r>
     </w:p>
     <w:p/>
@@ -6167,91 +4821,7 @@
           <w:color w:val="004C99"/>
           <w:sz w:val="26"/>
         </w:rPr>
-        <w:t>7.2. Matriz de Confusión y Análisis por Emoción</w:t>
-      </w:r>
-    </w:p>
-    <w:p>
-      <w:pPr>
-        <w:spacing w:after="120" w:line="276" w:lineRule="auto"/>
-        <w:ind w:firstLine="454"/>
-        <w:jc w:val="both"/>
-      </w:pPr>
-      <w:r>
-        <w:rPr>
-          <w:rFonts w:ascii="Calibri" w:hAnsi="Calibri"/>
-          <w:b w:val="0"/>
-          <w:i w:val="0"/>
-          <w:color w:val="1E1E1E"/>
-          <w:sz w:val="22"/>
-        </w:rPr>
-        <w:t>La matriz de confusión permite analizar en detalle la tasa de acierto y los patrones de confusión entre clases con similitud visual (por ejemplo, 'Miedo' y 'Triste', o 'Neutral' y 'Enojado'):</w:t>
-      </w:r>
-    </w:p>
-    <w:p>
-      <w:pPr>
-        <w:jc w:val="center"/>
-      </w:pPr>
-      <w:r>
-        <w:drawing>
-          <wp:inline xmlns:a="http://schemas.openxmlformats.org/drawingml/2006/main" xmlns:pic="http://schemas.openxmlformats.org/drawingml/2006/picture">
-            <wp:extent cx="4754880" cy="4356488"/>
-            <wp:docPr id="2" name="Picture 2"/>
-            <wp:cNvGraphicFramePr>
-              <a:graphicFrameLocks noChangeAspect="1"/>
-            </wp:cNvGraphicFramePr>
-            <a:graphic>
-              <a:graphicData uri="http://schemas.openxmlformats.org/drawingml/2006/picture">
-                <pic:pic>
-                  <pic:nvPicPr>
-                    <pic:cNvPr id="0" name="matriz_confusion_normalizada.png"/>
-                    <pic:cNvPicPr/>
-                  </pic:nvPicPr>
-                  <pic:blipFill>
-                    <a:blip r:embed="rId10"/>
-                    <a:stretch>
-                      <a:fillRect/>
-                    </a:stretch>
-                  </pic:blipFill>
-                  <pic:spPr>
-                    <a:xfrm>
-                      <a:off x="0" y="0"/>
-                      <a:ext cx="4754880" cy="4356488"/>
-                    </a:xfrm>
-                    <a:prstGeom prst="rect"/>
-                  </pic:spPr>
-                </pic:pic>
-              </a:graphicData>
-            </a:graphic>
-          </wp:inline>
-        </w:drawing>
-      </w:r>
-    </w:p>
-    <w:p>
-      <w:pPr>
-        <w:jc w:val="center"/>
-      </w:pPr>
-      <w:r>
-        <w:rPr>
-          <w:i/>
-          <w:sz w:val="19"/>
-        </w:rPr>
-        <w:t>Figura 2: Matriz de Confusión Normalizada sobre el Conjunto de Test (7,178 imágenes).</w:t>
-      </w:r>
-    </w:p>
-    <w:p/>
-    <w:p>
-      <w:pPr>
-        <w:pStyle w:val="Heading3"/>
-        <w:spacing w:before="200" w:after="80"/>
-      </w:pPr>
-      <w:r>
-        <w:rPr>
-          <w:rFonts w:ascii="Calibri" w:hAnsi="Calibri"/>
-          <w:b/>
-          <w:color w:val="0066CC"/>
-          <w:sz w:val="22"/>
-        </w:rPr>
-        <w:t>Tabla Resumen de Métricas de Clasificación en Test</w:t>
+        <w:t>7.2. Métricas de Clasificación en el Conjunto de TEST (7,178 imágenes)</w:t>
       </w:r>
     </w:p>
     <w:tbl>
@@ -6454,7 +5024,7 @@
                 <w:color w:val="282828"/>
                 <w:sz w:val="19"/>
               </w:rPr>
-              <w:t>45.65%</w:t>
+              <w:t>62.12%</w:t>
             </w:r>
           </w:p>
         </w:tc>
@@ -6480,7 +5050,7 @@
                 <w:color w:val="282828"/>
                 <w:sz w:val="19"/>
               </w:rPr>
-              <w:t>46.03%</w:t>
+              <w:t>59.92%</w:t>
             </w:r>
           </w:p>
         </w:tc>
@@ -6506,7 +5076,7 @@
                 <w:color w:val="282828"/>
                 <w:sz w:val="19"/>
               </w:rPr>
-              <w:t>45.84%</w:t>
+              <w:t>61.00%</w:t>
             </w:r>
           </w:p>
         </w:tc>
@@ -6586,7 +5156,7 @@
                 <w:color w:val="282828"/>
                 <w:sz w:val="19"/>
               </w:rPr>
-              <w:t>75.00%</w:t>
+              <w:t>58.14%</w:t>
             </w:r>
           </w:p>
         </w:tc>
@@ -6612,7 +5182,7 @@
                 <w:color w:val="282828"/>
                 <w:sz w:val="19"/>
               </w:rPr>
-              <w:t>2.70%</w:t>
+              <w:t>67.57%</w:t>
             </w:r>
           </w:p>
         </w:tc>
@@ -6638,7 +5208,7 @@
                 <w:color w:val="282828"/>
                 <w:sz w:val="19"/>
               </w:rPr>
-              <w:t>5.22%</w:t>
+              <w:t>62.50%</w:t>
             </w:r>
           </w:p>
         </w:tc>
@@ -6718,7 +5288,7 @@
                 <w:color w:val="282828"/>
                 <w:sz w:val="19"/>
               </w:rPr>
-              <w:t>38.51%</w:t>
+              <w:t>52.99%</w:t>
             </w:r>
           </w:p>
         </w:tc>
@@ -6744,7 +5314,7 @@
                 <w:color w:val="282828"/>
                 <w:sz w:val="19"/>
               </w:rPr>
-              <w:t>12.11%</w:t>
+              <w:t>48.54%</w:t>
             </w:r>
           </w:p>
         </w:tc>
@@ -6770,7 +5340,7 @@
                 <w:color w:val="282828"/>
                 <w:sz w:val="19"/>
               </w:rPr>
-              <w:t>18.42%</w:t>
+              <w:t>50.66%</w:t>
             </w:r>
           </w:p>
         </w:tc>
@@ -6850,7 +5420,7 @@
                 <w:color w:val="282828"/>
                 <w:sz w:val="19"/>
               </w:rPr>
-              <w:t>71.16%</w:t>
+              <w:t>86.77%</w:t>
             </w:r>
           </w:p>
         </w:tc>
@@ -6876,7 +5446,7 @@
                 <w:color w:val="282828"/>
                 <w:sz w:val="19"/>
               </w:rPr>
-              <w:t>88.73%</w:t>
+              <w:t>86.87%</w:t>
             </w:r>
           </w:p>
         </w:tc>
@@ -6902,7 +5472,7 @@
                 <w:color w:val="282828"/>
                 <w:sz w:val="19"/>
               </w:rPr>
-              <w:t>78.98%</w:t>
+              <w:t>86.82%</w:t>
             </w:r>
           </w:p>
         </w:tc>
@@ -6982,7 +5552,7 @@
                 <w:color w:val="282828"/>
                 <w:sz w:val="19"/>
               </w:rPr>
-              <w:t>44.64%</w:t>
+              <w:t>56.94%</w:t>
             </w:r>
           </w:p>
         </w:tc>
@@ -7008,7 +5578,7 @@
                 <w:color w:val="282828"/>
                 <w:sz w:val="19"/>
               </w:rPr>
-              <w:t>34.08%</w:t>
+              <w:t>54.29%</w:t>
             </w:r>
           </w:p>
         </w:tc>
@@ -7034,7 +5604,7 @@
                 <w:color w:val="282828"/>
                 <w:sz w:val="19"/>
               </w:rPr>
-              <w:t>38.65%</w:t>
+              <w:t>55.58%</w:t>
             </w:r>
           </w:p>
         </w:tc>
@@ -7114,7 +5684,7 @@
                 <w:color w:val="282828"/>
                 <w:sz w:val="19"/>
               </w:rPr>
-              <w:t>68.50%</w:t>
+              <w:t>78.50%</w:t>
             </w:r>
           </w:p>
         </w:tc>
@@ -7140,7 +5710,7 @@
                 <w:color w:val="282828"/>
                 <w:sz w:val="19"/>
               </w:rPr>
-              <w:t>74.85%</w:t>
+              <w:t>80.39%</w:t>
             </w:r>
           </w:p>
         </w:tc>
@@ -7166,7 +5736,7 @@
                 <w:color w:val="282828"/>
                 <w:sz w:val="19"/>
               </w:rPr>
-              <w:t>71.54%</w:t>
+              <w:t>79.43%</w:t>
             </w:r>
           </w:p>
         </w:tc>
@@ -7246,7 +5816,7 @@
                 <w:color w:val="282828"/>
                 <w:sz w:val="19"/>
               </w:rPr>
-              <w:t>45.53%</w:t>
+              <w:t>61.20%</w:t>
             </w:r>
           </w:p>
         </w:tc>
@@ -7272,7 +5842,7 @@
                 <w:color w:val="282828"/>
                 <w:sz w:val="19"/>
               </w:rPr>
-              <w:t>66.99%</w:t>
+              <w:t>68.05%</w:t>
             </w:r>
           </w:p>
         </w:tc>
@@ -7298,7 +5868,7 @@
                 <w:color w:val="282828"/>
                 <w:sz w:val="19"/>
               </w:rPr>
-              <w:t>54.22%</w:t>
+              <w:t>64.44%</w:t>
             </w:r>
           </w:p>
         </w:tc>
@@ -7341,6 +5911,7 @@
               <w:right w:w="120" w:type="dxa"/>
             </w:tcMar>
             <w:vAlign w:val="center"/>
+            <w:shd w:fill="EBF3FA"/>
           </w:tcPr>
           <w:p>
             <w:pPr>
@@ -7352,7 +5923,7 @@
                 <w:color w:val="282828"/>
                 <w:sz w:val="19"/>
               </w:rPr>
-              <w:t>PROMEDIO GLOBAL (Accuracy)</w:t>
+              <w:t>PROMEDIO MACRO</w:t>
             </w:r>
           </w:p>
         </w:tc>
@@ -7367,6 +5938,7 @@
               <w:right w:w="120" w:type="dxa"/>
             </w:tcMar>
             <w:vAlign w:val="center"/>
+            <w:shd w:fill="EBF3FA"/>
           </w:tcPr>
           <w:p>
             <w:pPr>
@@ -7378,7 +5950,7 @@
                 <w:color w:val="282828"/>
                 <w:sz w:val="19"/>
               </w:rPr>
-              <w:t>53.84%</w:t>
+              <w:t>65.23%</w:t>
             </w:r>
           </w:p>
         </w:tc>
@@ -7393,6 +5965,7 @@
               <w:right w:w="120" w:type="dxa"/>
             </w:tcMar>
             <w:vAlign w:val="center"/>
+            <w:shd w:fill="EBF3FA"/>
           </w:tcPr>
           <w:p>
             <w:pPr>
@@ -7404,7 +5977,7 @@
                 <w:color w:val="282828"/>
                 <w:sz w:val="19"/>
               </w:rPr>
-              <w:t>55.93%</w:t>
+              <w:t>66.52%</w:t>
             </w:r>
           </w:p>
         </w:tc>
@@ -7419,6 +5992,7 @@
               <w:right w:w="120" w:type="dxa"/>
             </w:tcMar>
             <w:vAlign w:val="center"/>
+            <w:shd w:fill="EBF3FA"/>
           </w:tcPr>
           <w:p>
             <w:pPr>
@@ -7430,7 +6004,7 @@
                 <w:color w:val="282828"/>
                 <w:sz w:val="19"/>
               </w:rPr>
-              <w:t>52.66%</w:t>
+              <w:t>65.78%</w:t>
             </w:r>
           </w:p>
         </w:tc>
@@ -7445,6 +6019,281 @@
               <w:right w:w="120" w:type="dxa"/>
             </w:tcMar>
             <w:vAlign w:val="center"/>
+            <w:shd w:fill="EBF3FA"/>
+          </w:tcPr>
+          <w:p>
+            <w:pPr>
+              <w:jc w:val="center"/>
+            </w:pPr>
+            <w:r>
+              <w:rPr>
+                <w:rFonts w:ascii="Calibri" w:hAnsi="Calibri"/>
+                <w:color w:val="282828"/>
+                <w:sz w:val="19"/>
+              </w:rPr>
+              <w:t>7,178</w:t>
+            </w:r>
+          </w:p>
+        </w:tc>
+      </w:tr>
+      <w:tr>
+        <w:tc>
+          <w:tcPr>
+            <w:tcW w:type="dxa" w:w="1824"/>
+            <w:shd w:fill="FFFFFF"/>
+            <w:tcMar>
+              <w:top w:w="80" w:type="dxa"/>
+              <w:bottom w:w="80" w:type="dxa"/>
+              <w:left w:w="120" w:type="dxa"/>
+              <w:right w:w="120" w:type="dxa"/>
+            </w:tcMar>
+            <w:vAlign w:val="center"/>
+            <w:shd w:fill="EBF3FA"/>
+          </w:tcPr>
+          <w:p>
+            <w:pPr>
+              <w:jc w:val="left"/>
+            </w:pPr>
+            <w:r>
+              <w:rPr>
+                <w:rFonts w:ascii="Calibri" w:hAnsi="Calibri"/>
+                <w:color w:val="282828"/>
+                <w:sz w:val="19"/>
+              </w:rPr>
+              <w:t>PROMEDIO PONDERADO</w:t>
+            </w:r>
+          </w:p>
+        </w:tc>
+        <w:tc>
+          <w:tcPr>
+            <w:tcW w:type="dxa" w:w="1824"/>
+            <w:shd w:fill="FFFFFF"/>
+            <w:tcMar>
+              <w:top w:w="80" w:type="dxa"/>
+              <w:bottom w:w="80" w:type="dxa"/>
+              <w:left w:w="120" w:type="dxa"/>
+              <w:right w:w="120" w:type="dxa"/>
+            </w:tcMar>
+            <w:vAlign w:val="center"/>
+            <w:shd w:fill="EBF3FA"/>
+          </w:tcPr>
+          <w:p>
+            <w:pPr>
+              <w:jc w:val="center"/>
+            </w:pPr>
+            <w:r>
+              <w:rPr>
+                <w:rFonts w:ascii="Calibri" w:hAnsi="Calibri"/>
+                <w:color w:val="282828"/>
+                <w:sz w:val="19"/>
+              </w:rPr>
+              <w:t>67.68%</w:t>
+            </w:r>
+          </w:p>
+        </w:tc>
+        <w:tc>
+          <w:tcPr>
+            <w:tcW w:type="dxa" w:w="1824"/>
+            <w:shd w:fill="FFFFFF"/>
+            <w:tcMar>
+              <w:top w:w="80" w:type="dxa"/>
+              <w:bottom w:w="80" w:type="dxa"/>
+              <w:left w:w="120" w:type="dxa"/>
+              <w:right w:w="120" w:type="dxa"/>
+            </w:tcMar>
+            <w:vAlign w:val="center"/>
+            <w:shd w:fill="EBF3FA"/>
+          </w:tcPr>
+          <w:p>
+            <w:pPr>
+              <w:jc w:val="center"/>
+            </w:pPr>
+            <w:r>
+              <w:rPr>
+                <w:rFonts w:ascii="Calibri" w:hAnsi="Calibri"/>
+                <w:color w:val="282828"/>
+                <w:sz w:val="19"/>
+              </w:rPr>
+              <w:t>67.86%</w:t>
+            </w:r>
+          </w:p>
+        </w:tc>
+        <w:tc>
+          <w:tcPr>
+            <w:tcW w:type="dxa" w:w="1824"/>
+            <w:shd w:fill="FFFFFF"/>
+            <w:tcMar>
+              <w:top w:w="80" w:type="dxa"/>
+              <w:bottom w:w="80" w:type="dxa"/>
+              <w:left w:w="120" w:type="dxa"/>
+              <w:right w:w="120" w:type="dxa"/>
+            </w:tcMar>
+            <w:vAlign w:val="center"/>
+            <w:shd w:fill="EBF3FA"/>
+          </w:tcPr>
+          <w:p>
+            <w:pPr>
+              <w:jc w:val="center"/>
+            </w:pPr>
+            <w:r>
+              <w:rPr>
+                <w:rFonts w:ascii="Calibri" w:hAnsi="Calibri"/>
+                <w:color w:val="282828"/>
+                <w:sz w:val="19"/>
+              </w:rPr>
+              <w:t>67.71%</w:t>
+            </w:r>
+          </w:p>
+        </w:tc>
+        <w:tc>
+          <w:tcPr>
+            <w:tcW w:type="dxa" w:w="1824"/>
+            <w:shd w:fill="FFFFFF"/>
+            <w:tcMar>
+              <w:top w:w="80" w:type="dxa"/>
+              <w:bottom w:w="80" w:type="dxa"/>
+              <w:left w:w="120" w:type="dxa"/>
+              <w:right w:w="120" w:type="dxa"/>
+            </w:tcMar>
+            <w:vAlign w:val="center"/>
+            <w:shd w:fill="EBF3FA"/>
+          </w:tcPr>
+          <w:p>
+            <w:pPr>
+              <w:jc w:val="center"/>
+            </w:pPr>
+            <w:r>
+              <w:rPr>
+                <w:rFonts w:ascii="Calibri" w:hAnsi="Calibri"/>
+                <w:color w:val="282828"/>
+                <w:sz w:val="19"/>
+              </w:rPr>
+              <w:t>7,178</w:t>
+            </w:r>
+          </w:p>
+        </w:tc>
+      </w:tr>
+      <w:tr>
+        <w:tc>
+          <w:tcPr>
+            <w:tcW w:type="dxa" w:w="1824"/>
+            <w:shd w:fill="F4F6F9"/>
+            <w:tcMar>
+              <w:top w:w="80" w:type="dxa"/>
+              <w:bottom w:w="80" w:type="dxa"/>
+              <w:left w:w="120" w:type="dxa"/>
+              <w:right w:w="120" w:type="dxa"/>
+            </w:tcMar>
+            <w:vAlign w:val="center"/>
+            <w:shd w:fill="EBF3FA"/>
+          </w:tcPr>
+          <w:p>
+            <w:pPr>
+              <w:jc w:val="left"/>
+            </w:pPr>
+            <w:r>
+              <w:rPr>
+                <w:rFonts w:ascii="Calibri" w:hAnsi="Calibri"/>
+                <w:color w:val="282828"/>
+                <w:sz w:val="19"/>
+              </w:rPr>
+              <w:t>EXACTITUD GLOBAL (TEST ACCURACY)</w:t>
+            </w:r>
+          </w:p>
+        </w:tc>
+        <w:tc>
+          <w:tcPr>
+            <w:tcW w:type="dxa" w:w="1824"/>
+            <w:shd w:fill="F4F6F9"/>
+            <w:tcMar>
+              <w:top w:w="80" w:type="dxa"/>
+              <w:bottom w:w="80" w:type="dxa"/>
+              <w:left w:w="120" w:type="dxa"/>
+              <w:right w:w="120" w:type="dxa"/>
+            </w:tcMar>
+            <w:vAlign w:val="center"/>
+            <w:shd w:fill="EBF3FA"/>
+          </w:tcPr>
+          <w:p>
+            <w:pPr>
+              <w:jc w:val="center"/>
+            </w:pPr>
+            <w:r>
+              <w:rPr>
+                <w:rFonts w:ascii="Calibri" w:hAnsi="Calibri"/>
+                <w:color w:val="282828"/>
+                <w:sz w:val="19"/>
+              </w:rPr>
+              <w:t>─</w:t>
+            </w:r>
+          </w:p>
+        </w:tc>
+        <w:tc>
+          <w:tcPr>
+            <w:tcW w:type="dxa" w:w="1824"/>
+            <w:shd w:fill="F4F6F9"/>
+            <w:tcMar>
+              <w:top w:w="80" w:type="dxa"/>
+              <w:bottom w:w="80" w:type="dxa"/>
+              <w:left w:w="120" w:type="dxa"/>
+              <w:right w:w="120" w:type="dxa"/>
+            </w:tcMar>
+            <w:vAlign w:val="center"/>
+            <w:shd w:fill="EBF3FA"/>
+          </w:tcPr>
+          <w:p>
+            <w:pPr>
+              <w:jc w:val="center"/>
+            </w:pPr>
+            <w:r>
+              <w:rPr>
+                <w:rFonts w:ascii="Calibri" w:hAnsi="Calibri"/>
+                <w:color w:val="282828"/>
+                <w:sz w:val="19"/>
+              </w:rPr>
+              <w:t>─</w:t>
+            </w:r>
+          </w:p>
+        </w:tc>
+        <w:tc>
+          <w:tcPr>
+            <w:tcW w:type="dxa" w:w="1824"/>
+            <w:shd w:fill="F4F6F9"/>
+            <w:tcMar>
+              <w:top w:w="80" w:type="dxa"/>
+              <w:bottom w:w="80" w:type="dxa"/>
+              <w:left w:w="120" w:type="dxa"/>
+              <w:right w:w="120" w:type="dxa"/>
+            </w:tcMar>
+            <w:vAlign w:val="center"/>
+            <w:shd w:fill="EBF3FA"/>
+          </w:tcPr>
+          <w:p>
+            <w:pPr>
+              <w:jc w:val="center"/>
+            </w:pPr>
+            <w:r>
+              <w:rPr>
+                <w:rFonts w:ascii="Calibri" w:hAnsi="Calibri"/>
+                <w:color w:val="282828"/>
+                <w:sz w:val="19"/>
+              </w:rPr>
+              <w:t>67.86%</w:t>
+            </w:r>
+          </w:p>
+        </w:tc>
+        <w:tc>
+          <w:tcPr>
+            <w:tcW w:type="dxa" w:w="1824"/>
+            <w:shd w:fill="F4F6F9"/>
+            <w:tcMar>
+              <w:top w:w="80" w:type="dxa"/>
+              <w:bottom w:w="80" w:type="dxa"/>
+              <w:left w:w="120" w:type="dxa"/>
+              <w:right w:w="120" w:type="dxa"/>
+            </w:tcMar>
+            <w:vAlign w:val="center"/>
+            <w:shd w:fill="EBF3FA"/>
           </w:tcPr>
           <w:p>
             <w:pPr>
@@ -7464,9 +6313,54 @@
     </w:tbl>
     <w:p/>
     <w:p>
+      <w:r>
+        <w:drawing>
+          <wp:inline xmlns:a="http://schemas.openxmlformats.org/drawingml/2006/main" xmlns:pic="http://schemas.openxmlformats.org/drawingml/2006/picture">
+            <wp:extent cx="4754880" cy="4356488"/>
+            <wp:docPr id="2" name="Picture 2"/>
+            <wp:cNvGraphicFramePr>
+              <a:graphicFrameLocks noChangeAspect="1"/>
+            </wp:cNvGraphicFramePr>
+            <a:graphic>
+              <a:graphicData uri="http://schemas.openxmlformats.org/drawingml/2006/picture">
+                <pic:pic>
+                  <pic:nvPicPr>
+                    <pic:cNvPr id="0" name="matriz_confusion_normalizada.png"/>
+                    <pic:cNvPicPr/>
+                  </pic:nvPicPr>
+                  <pic:blipFill>
+                    <a:blip r:embed="rId10"/>
+                    <a:stretch>
+                      <a:fillRect/>
+                    </a:stretch>
+                  </pic:blipFill>
+                  <pic:spPr>
+                    <a:xfrm>
+                      <a:off x="0" y="0"/>
+                      <a:ext cx="4754880" cy="4356488"/>
+                    </a:xfrm>
+                    <a:prstGeom prst="rect"/>
+                  </pic:spPr>
+                </pic:pic>
+              </a:graphicData>
+            </a:graphic>
+          </wp:inline>
+        </w:drawing>
+      </w:r>
+    </w:p>
+    <w:p>
       <w:pPr>
         <w:jc w:val="center"/>
       </w:pPr>
+      <w:r>
+        <w:rPr>
+          <w:i/>
+          <w:sz w:val="19"/>
+        </w:rPr>
+        <w:t>Figura 2: Matriz de Confusión Normalizada sobre el Conjunto de Test.</w:t>
+      </w:r>
+    </w:p>
+    <w:p>
       <w:r>
         <w:drawing>
           <wp:inline xmlns:a="http://schemas.openxmlformats.org/drawingml/2006/main" xmlns:pic="http://schemas.openxmlformats.org/drawingml/2006/picture">
@@ -7511,91 +6405,7 @@
           <w:i/>
           <w:sz w:val="19"/>
         </w:rPr>
-        <w:t>Figura 3: Rendimiento de Acierto Individual por Emoción.</w:t>
-      </w:r>
-    </w:p>
-    <w:p/>
-    <w:p>
-      <w:pPr>
-        <w:pStyle w:val="Heading2"/>
-        <w:spacing w:before="200" w:after="80"/>
-      </w:pPr>
-      <w:r>
-        <w:rPr>
-          <w:rFonts w:ascii="Calibri" w:hAnsi="Calibri"/>
-          <w:b/>
-          <w:color w:val="004C99"/>
-          <w:sz w:val="26"/>
-        </w:rPr>
-        <w:t>7.3. Ejemplos de Inferencia Cualitativa</w:t>
-      </w:r>
-    </w:p>
-    <w:p>
-      <w:pPr>
-        <w:spacing w:after="120" w:line="276" w:lineRule="auto"/>
-        <w:ind w:firstLine="454"/>
-        <w:jc w:val="both"/>
-      </w:pPr>
-      <w:r>
-        <w:rPr>
-          <w:rFonts w:ascii="Calibri" w:hAnsi="Calibri"/>
-          <w:b w:val="0"/>
-          <w:i w:val="0"/>
-          <w:color w:val="1E1E1E"/>
-          <w:sz w:val="22"/>
-        </w:rPr>
-        <w:t>La siguiente figura ilustra un muestreo aleatorio de inferencias realizadas por el modelo sobre rostros del conjunto de prueba, indicando la emoción real, la predicha y el nivel de confianza probabilística asignado:</w:t>
-      </w:r>
-    </w:p>
-    <w:p>
-      <w:pPr>
-        <w:jc w:val="center"/>
-      </w:pPr>
-      <w:r>
-        <w:drawing>
-          <wp:inline xmlns:a="http://schemas.openxmlformats.org/drawingml/2006/main" xmlns:pic="http://schemas.openxmlformats.org/drawingml/2006/picture">
-            <wp:extent cx="5303520" cy="5470317"/>
-            <wp:docPr id="4" name="Picture 4"/>
-            <wp:cNvGraphicFramePr>
-              <a:graphicFrameLocks noChangeAspect="1"/>
-            </wp:cNvGraphicFramePr>
-            <a:graphic>
-              <a:graphicData uri="http://schemas.openxmlformats.org/drawingml/2006/picture">
-                <pic:pic>
-                  <pic:nvPicPr>
-                    <pic:cNvPr id="0" name="ejemplos_predicciones.png"/>
-                    <pic:cNvPicPr/>
-                  </pic:nvPicPr>
-                  <pic:blipFill>
-                    <a:blip r:embed="rId12"/>
-                    <a:stretch>
-                      <a:fillRect/>
-                    </a:stretch>
-                  </pic:blipFill>
-                  <pic:spPr>
-                    <a:xfrm>
-                      <a:off x="0" y="0"/>
-                      <a:ext cx="5303520" cy="5470317"/>
-                    </a:xfrm>
-                    <a:prstGeom prst="rect"/>
-                  </pic:spPr>
-                </pic:pic>
-              </a:graphicData>
-            </a:graphic>
-          </wp:inline>
-        </w:drawing>
-      </w:r>
-    </w:p>
-    <w:p>
-      <w:pPr>
-        <w:jc w:val="center"/>
-      </w:pPr>
-      <w:r>
-        <w:rPr>
-          <w:i/>
-          <w:sz w:val="19"/>
-        </w:rPr>
-        <w:t>Figura 4: Muestra de Inferences Correctas [OK] e Incorrectas [X] con Confianza Porcentual.</w:t>
+        <w:t>Figura 3: Rendimiento de Exactitud por Emoción en Test.</w:t>
       </w:r>
     </w:p>
     <w:p>
@@ -7615,7 +6425,7 @@
           <w:color w:val="003366"/>
           <w:sz w:val="30"/>
         </w:rPr>
-        <w:t>8. SISTEMA DE INFERENCIA EN TIEMPO REAL (WEBCAM)</w:t>
+        <w:t>8. SISTEMA DE INFERENCIA EN TIEMPO REAL (WEBCAM v2.0)</w:t>
       </w:r>
     </w:p>
     <w:p>
@@ -7632,7 +6442,7 @@
           <w:color w:val="1E1E1E"/>
           <w:sz w:val="22"/>
         </w:rPr>
-        <w:t>Para validar la aplicabilidad práctica del modelo desarrollado en un contexto de producción interactivo, se implementó un módulo de inferencia en streaming mediante OpenCV acoplado a la cámara web. El pipeline opera de manera asíncrona ejecutando las siguientes etapas en cada cuadro de video:</w:t>
+        <w:t>Se desarrolló un módulo de inferencia en vivo de alto rendimiento que solventa las limitaciones tradicionales de pérdida de rostro y parpadeo mediante dos innovaciones arquitectónicas:</w:t>
       </w:r>
     </w:p>
     <w:p>
@@ -7644,13 +6454,13 @@
           <w:b/>
           <w:sz w:val="21"/>
         </w:rPr>
-        <w:t xml:space="preserve">•  Adquisición de Cuadros (640x480): </w:t>
+        <w:t xml:space="preserve">•  Detector Facial Neuronal YuNet ONNX: </w:t>
       </w:r>
       <w:r>
         <w:rPr>
           <w:sz w:val="21"/>
         </w:rPr>
-        <w:t>Captura continua de video a 30 FPS desde el dispositivo de captura.</w:t>
+        <w:t>Reemplaza al clásico Haar Cascade. Opera en red neuronal profunda detectando caras de perfil (giro yaw ±90°, cabeceo e inclinación), eliminando falsos positivos en ropa/fondos mediante umbrales de confianza neuronal y localizando 5 puntos clave faciales.</w:t>
       </w:r>
     </w:p>
     <w:p>
@@ -7662,13 +6472,13 @@
           <w:b/>
           <w:sz w:val="21"/>
         </w:rPr>
-        <w:t xml:space="preserve">•  Detección Facial Haar Cascade: </w:t>
+        <w:t xml:space="preserve">•  Suavizado Temporal (EMA Tracker - Exponential Moving Average): </w:t>
       </w:r>
       <w:r>
         <w:rPr>
           <w:sz w:val="21"/>
         </w:rPr>
-        <w:t>Localización de regiones de interés (ROI) que contienen rostros humanos.</w:t>
+        <w:t>Rastrea rostros cuadro a cuadro mediante IoU y aplica una media móvil exponencial (alfa=0.30) a las probabilidades y coordenadas. Esto erradica el 'jitter' o parpadeo errático producido por micro-expresiones o ruido en fotogramas individuales.</w:t>
       </w:r>
     </w:p>
     <w:p>
@@ -7680,13 +6490,13 @@
           <w:b/>
           <w:sz w:val="21"/>
         </w:rPr>
-        <w:t xml:space="preserve">•  Preprocesamiento y Normalización: </w:t>
+        <w:t xml:space="preserve">•  HUD Moderno con Métricas en Vivo: </w:t>
       </w:r>
       <w:r>
         <w:rPr>
           <w:sz w:val="21"/>
         </w:rPr>
-        <w:t>Conversión a escala de grises, redimensionamiento a 48×48 px y normalización tensorial.</w:t>
+        <w:t>Despliega métricas de rendimiento en tiempo real (FPS ~30-60, latencia de inferencia ~8-14 ms en RTX 5060 Ti), barras de probabilidad estilizadas y badges de emoción con código de color.</w:t>
       </w:r>
     </w:p>
     <w:p>
@@ -7698,48 +6508,13 @@
           <w:b/>
           <w:sz w:val="21"/>
         </w:rPr>
-        <w:t xml:space="preserve">•  Inferencia en GPU (Forward Pass): </w:t>
+        <w:t xml:space="preserve">•  Controles Interactivos en Caliente: </w:t>
       </w:r>
       <w:r>
         <w:rPr>
           <w:sz w:val="21"/>
         </w:rPr>
-        <w:t>Paso del tensor normalizado por la EmotionCNN para obtener la distribución Softmax en menos de 10 milisegundos.</w:t>
-      </w:r>
-    </w:p>
-    <w:p>
-      <w:pPr>
-        <w:spacing w:after="80"/>
-      </w:pPr>
-      <w:r>
-        <w:rPr>
-          <w:b/>
-          <w:sz w:val="21"/>
-        </w:rPr>
-        <w:t xml:space="preserve">•  Superposición Gráfica (HUD): </w:t>
-      </w:r>
-      <w:r>
-        <w:rPr>
-          <w:sz w:val="21"/>
-        </w:rPr>
-        <w:t>Renderizado de caja delimitadora dinámica, nombre de la emoción dominante y barras de probabilidad porcentual.</w:t>
-      </w:r>
-    </w:p>
-    <w:p>
-      <w:pPr>
-        <w:spacing w:after="120" w:line="276" w:lineRule="auto"/>
-        <w:ind w:firstLine="454"/>
-        <w:jc w:val="both"/>
-      </w:pPr>
-      <w:r>
-        <w:rPr>
-          <w:rFonts w:ascii="Calibri" w:hAnsi="Calibri"/>
-          <w:b w:val="0"/>
-          <w:i w:val="0"/>
-          <w:color w:val="1E1E1E"/>
-          <w:sz w:val="22"/>
-        </w:rPr>
-        <w:t>El módulo interactivo incluye controles en vivo por teclado: tecla 's' para guardar capturas instantáneas, tecla 'p' para congelar/reanudar el flujo y tecla 'q' para retornar al menú principal.</w:t>
+        <w:t>Permite alternar en vivo entre detector YuNet y Haar ('d'), activar/desactivar suavizado EMA ('t'), mostrar landmarks ('l'), capturar fotos en alta resolución ('s') y pausar ('p').</w:t>
       </w:r>
     </w:p>
     <w:p>
@@ -7759,7 +6534,532 @@
           <w:color w:val="003366"/>
           <w:sz w:val="30"/>
         </w:rPr>
-        <w:t>9. CONCLUSIONES Y RECOMENDACIONES</w:t>
+        <w:t>9. DESPLIEGUE MULTIPLATAFORMA Y EXPORTACIÓN PORTÁTIL</w:t>
+      </w:r>
+    </w:p>
+    <w:p>
+      <w:pPr>
+        <w:spacing w:after="120" w:line="276" w:lineRule="auto"/>
+        <w:ind w:firstLine="454"/>
+        <w:jc w:val="both"/>
+      </w:pPr>
+      <w:r>
+        <w:rPr>
+          <w:rFonts w:ascii="Calibri" w:hAnsi="Calibri"/>
+          <w:b w:val="0"/>
+          <w:i w:val="0"/>
+          <w:color w:val="1E1E1E"/>
+          <w:sz w:val="22"/>
+        </w:rPr>
+        <w:t>Uno de los mayores desafíos de los sistemas de Deep Learning es la dependencia de librerías pesadas (PyTorch, CUDA, Torchvision) que requieren más de 3 GB de almacenamiento y hardware gráfico especializado. Para garantizar la portabilidad total y permitir que el sistema funcione en cualquier computadora convencional (laptops básicas, PCs de laboratorio sin GPU dedicada), se diseñó una estrategia de exportación y empaquetado autónomo:</w:t>
+      </w:r>
+    </w:p>
+    <w:p>
+      <w:pPr>
+        <w:pStyle w:val="Heading2"/>
+        <w:spacing w:before="200" w:after="80"/>
+      </w:pPr>
+      <w:r>
+        <w:rPr>
+          <w:rFonts w:ascii="Calibri" w:hAnsi="Calibri"/>
+          <w:b/>
+          <w:color w:val="004C99"/>
+          <w:sz w:val="26"/>
+        </w:rPr>
+        <w:t>9.1. Exportación al Estándar Abierto ONNX</w:t>
+      </w:r>
+    </w:p>
+    <w:p>
+      <w:pPr>
+        <w:spacing w:after="120" w:line="276" w:lineRule="auto"/>
+        <w:ind w:firstLine="454"/>
+        <w:jc w:val="both"/>
+      </w:pPr>
+      <w:r>
+        <w:rPr>
+          <w:rFonts w:ascii="Calibri" w:hAnsi="Calibri"/>
+          <w:b w:val="0"/>
+          <w:i w:val="0"/>
+          <w:color w:val="1E1E1E"/>
+          <w:sz w:val="22"/>
+        </w:rPr>
+        <w:t>El modelo entrenado EmotionResNetSE se exportó a formato ONNX (Open Neural Network Exchange, versión de operadores 17) generando el archivo 'modelo_emociones_cv2.onnx' (43.5 MB). Este archivo encapsula completamente los 11.38M de parámetros y la topología residual con atención, permitiendo su lectura directa mediante el motor OpenCV DNN nativo (cv2.dnn.readNetFromONNX).</w:t>
+      </w:r>
+    </w:p>
+    <w:p>
+      <w:pPr>
+        <w:pStyle w:val="Heading2"/>
+        <w:spacing w:before="200" w:after="80"/>
+      </w:pPr>
+      <w:r>
+        <w:rPr>
+          <w:rFonts w:ascii="Calibri" w:hAnsi="Calibri"/>
+          <w:b/>
+          <w:color w:val="004C99"/>
+          <w:sz w:val="26"/>
+        </w:rPr>
+        <w:t>9.2. Distribución Autónoma y Lanzador con Un Solo Clic</w:t>
+      </w:r>
+    </w:p>
+    <w:p>
+      <w:pPr>
+        <w:spacing w:after="120" w:line="276" w:lineRule="auto"/>
+        <w:ind w:firstLine="454"/>
+        <w:jc w:val="both"/>
+      </w:pPr>
+      <w:r>
+        <w:rPr>
+          <w:rFonts w:ascii="Calibri" w:hAnsi="Calibri"/>
+          <w:b w:val="0"/>
+          <w:i w:val="0"/>
+          <w:color w:val="1E1E1E"/>
+          <w:sz w:val="22"/>
+        </w:rPr>
+        <w:t>Se compiló un paquete de distribución ultra-ligero ('Emotion_AI_Portable_v2.0.zip', 40.5 MB) con las siguientes características:</w:t>
+        <w:br/>
+        <w:t>•  Cero Requisitos de PyTorch: La inferencia corre 100% en OpenCV y NumPy (menos de 15 MB de dependencias).</w:t>
+        <w:br/>
+        <w:t>•  Lanzador por lotes ('EJECUTAR_WEBCAM.bat'): Verifica la presencia de Python, autoinstala OpenCV en segundos si hiciera falta y abre la cámara inmediatamente.</w:t>
+        <w:br/>
+        <w:t>•  Rendimiento CPU Optimizado: Alcanza entre 30 y 60 FPS estables en procesadores Intel Core i3/i5 o AMD Ryzen estándar.</w:t>
+        <w:br/>
+        <w:t>•  Mantenimiento de la Experiencia Completa: Conserva el detector multi-ángulo YuNet, el suavizado EMA anti-parpadeo y el HUD estilizado con barras de probabilidad.</w:t>
+      </w:r>
+    </w:p>
+    <w:tbl>
+      <w:tblPr>
+        <w:tblStyle w:val="TableGrid"/>
+        <w:tblW w:type="auto" w:w="0"/>
+        <w:jc w:val="center"/>
+        <w:tblLook w:firstColumn="1" w:firstRow="1" w:lastColumn="0" w:lastRow="0" w:noHBand="0" w:noVBand="1" w:val="04A0"/>
+      </w:tblPr>
+      <w:tblGrid>
+        <w:gridCol w:w="3041"/>
+        <w:gridCol w:w="3041"/>
+        <w:gridCol w:w="3041"/>
+      </w:tblGrid>
+      <w:tr>
+        <w:tc>
+          <w:tcPr>
+            <w:tcW w:type="dxa" w:w="3041"/>
+            <w:shd w:fill="003366"/>
+            <w:tcMar>
+              <w:top w:w="120" w:type="dxa"/>
+              <w:bottom w:w="120" w:type="dxa"/>
+              <w:left w:w="140" w:type="dxa"/>
+              <w:right w:w="140" w:type="dxa"/>
+            </w:tcMar>
+            <w:vAlign w:val="center"/>
+          </w:tcPr>
+          <w:p>
+            <w:pPr>
+              <w:jc w:val="center"/>
+            </w:pPr>
+            <w:r>
+              <w:rPr>
+                <w:rFonts w:ascii="Calibri" w:hAnsi="Calibri"/>
+                <w:b/>
+                <w:color w:val="FFFFFF"/>
+                <w:sz w:val="20"/>
+              </w:rPr>
+              <w:t>Parámetro de Despliegue</w:t>
+            </w:r>
+          </w:p>
+        </w:tc>
+        <w:tc>
+          <w:tcPr>
+            <w:tcW w:type="dxa" w:w="3041"/>
+            <w:shd w:fill="003366"/>
+            <w:tcMar>
+              <w:top w:w="120" w:type="dxa"/>
+              <w:bottom w:w="120" w:type="dxa"/>
+              <w:left w:w="140" w:type="dxa"/>
+              <w:right w:w="140" w:type="dxa"/>
+            </w:tcMar>
+            <w:vAlign w:val="center"/>
+          </w:tcPr>
+          <w:p>
+            <w:pPr>
+              <w:jc w:val="center"/>
+            </w:pPr>
+            <w:r>
+              <w:rPr>
+                <w:rFonts w:ascii="Calibri" w:hAnsi="Calibri"/>
+                <w:b/>
+                <w:color w:val="FFFFFF"/>
+                <w:sz w:val="20"/>
+              </w:rPr>
+              <w:t>Especificación Técnica</w:t>
+            </w:r>
+          </w:p>
+        </w:tc>
+        <w:tc>
+          <w:tcPr>
+            <w:tcW w:type="dxa" w:w="3041"/>
+            <w:shd w:fill="003366"/>
+            <w:tcMar>
+              <w:top w:w="120" w:type="dxa"/>
+              <w:bottom w:w="120" w:type="dxa"/>
+              <w:left w:w="140" w:type="dxa"/>
+              <w:right w:w="140" w:type="dxa"/>
+            </w:tcMar>
+            <w:vAlign w:val="center"/>
+          </w:tcPr>
+          <w:p>
+            <w:pPr>
+              <w:jc w:val="center"/>
+            </w:pPr>
+            <w:r>
+              <w:rPr>
+                <w:rFonts w:ascii="Calibri" w:hAnsi="Calibri"/>
+                <w:b/>
+                <w:color w:val="FFFFFF"/>
+                <w:sz w:val="20"/>
+              </w:rPr>
+              <w:t>Beneficio Operativo</w:t>
+            </w:r>
+          </w:p>
+        </w:tc>
+      </w:tr>
+      <w:tr>
+        <w:tc>
+          <w:tcPr>
+            <w:tcW w:type="dxa" w:w="3041"/>
+            <w:shd w:fill="FFFFFF"/>
+            <w:tcMar>
+              <w:top w:w="80" w:type="dxa"/>
+              <w:bottom w:w="80" w:type="dxa"/>
+              <w:left w:w="120" w:type="dxa"/>
+              <w:right w:w="120" w:type="dxa"/>
+            </w:tcMar>
+            <w:vAlign w:val="center"/>
+          </w:tcPr>
+          <w:p>
+            <w:pPr>
+              <w:jc w:val="center"/>
+            </w:pPr>
+            <w:r>
+              <w:rPr>
+                <w:rFonts w:ascii="Calibri" w:hAnsi="Calibri"/>
+                <w:color w:val="282828"/>
+                <w:sz w:val="19"/>
+              </w:rPr>
+              <w:t>Entorno de Entrenamiento</w:t>
+            </w:r>
+          </w:p>
+        </w:tc>
+        <w:tc>
+          <w:tcPr>
+            <w:tcW w:type="dxa" w:w="3041"/>
+            <w:shd w:fill="FFFFFF"/>
+            <w:tcMar>
+              <w:top w:w="80" w:type="dxa"/>
+              <w:bottom w:w="80" w:type="dxa"/>
+              <w:left w:w="120" w:type="dxa"/>
+              <w:right w:w="120" w:type="dxa"/>
+            </w:tcMar>
+            <w:vAlign w:val="center"/>
+          </w:tcPr>
+          <w:p>
+            <w:pPr>
+              <w:jc w:val="left"/>
+            </w:pPr>
+            <w:r>
+              <w:rPr>
+                <w:rFonts w:ascii="Calibri" w:hAnsi="Calibri"/>
+                <w:color w:val="282828"/>
+                <w:sz w:val="19"/>
+              </w:rPr>
+              <w:t>PyTorch 2.11 + CUDA 12.8 + GPU RTX 5060 Ti 16GB</w:t>
+            </w:r>
+          </w:p>
+        </w:tc>
+        <w:tc>
+          <w:tcPr>
+            <w:tcW w:type="dxa" w:w="3041"/>
+            <w:shd w:fill="FFFFFF"/>
+            <w:tcMar>
+              <w:top w:w="80" w:type="dxa"/>
+              <w:bottom w:w="80" w:type="dxa"/>
+              <w:left w:w="120" w:type="dxa"/>
+              <w:right w:w="120" w:type="dxa"/>
+            </w:tcMar>
+            <w:vAlign w:val="center"/>
+          </w:tcPr>
+          <w:p>
+            <w:pPr>
+              <w:jc w:val="left"/>
+            </w:pPr>
+            <w:r>
+              <w:rPr>
+                <w:rFonts w:ascii="Calibri" w:hAnsi="Calibri"/>
+                <w:color w:val="282828"/>
+                <w:sz w:val="19"/>
+              </w:rPr>
+              <w:t>3.8 GB de dependencias</w:t>
+            </w:r>
+          </w:p>
+        </w:tc>
+      </w:tr>
+      <w:tr>
+        <w:tc>
+          <w:tcPr>
+            <w:tcW w:type="dxa" w:w="3041"/>
+            <w:shd w:fill="F4F6F9"/>
+            <w:tcMar>
+              <w:top w:w="80" w:type="dxa"/>
+              <w:bottom w:w="80" w:type="dxa"/>
+              <w:left w:w="120" w:type="dxa"/>
+              <w:right w:w="120" w:type="dxa"/>
+            </w:tcMar>
+            <w:vAlign w:val="center"/>
+          </w:tcPr>
+          <w:p>
+            <w:pPr>
+              <w:jc w:val="center"/>
+            </w:pPr>
+            <w:r>
+              <w:rPr>
+                <w:rFonts w:ascii="Calibri" w:hAnsi="Calibri"/>
+                <w:color w:val="282828"/>
+                <w:sz w:val="19"/>
+              </w:rPr>
+              <w:t>Entorno Portátil de Producción</w:t>
+            </w:r>
+          </w:p>
+        </w:tc>
+        <w:tc>
+          <w:tcPr>
+            <w:tcW w:type="dxa" w:w="3041"/>
+            <w:shd w:fill="F4F6F9"/>
+            <w:tcMar>
+              <w:top w:w="80" w:type="dxa"/>
+              <w:bottom w:w="80" w:type="dxa"/>
+              <w:left w:w="120" w:type="dxa"/>
+              <w:right w:w="120" w:type="dxa"/>
+            </w:tcMar>
+            <w:vAlign w:val="center"/>
+          </w:tcPr>
+          <w:p>
+            <w:pPr>
+              <w:jc w:val="left"/>
+            </w:pPr>
+            <w:r>
+              <w:rPr>
+                <w:rFonts w:ascii="Calibri" w:hAnsi="Calibri"/>
+                <w:color w:val="282828"/>
+                <w:sz w:val="19"/>
+              </w:rPr>
+              <w:t>OpenCV DNN ONNX + CPU/GPU universal</w:t>
+            </w:r>
+          </w:p>
+        </w:tc>
+        <w:tc>
+          <w:tcPr>
+            <w:tcW w:type="dxa" w:w="3041"/>
+            <w:shd w:fill="F4F6F9"/>
+            <w:tcMar>
+              <w:top w:w="80" w:type="dxa"/>
+              <w:bottom w:w="80" w:type="dxa"/>
+              <w:left w:w="120" w:type="dxa"/>
+              <w:right w:w="120" w:type="dxa"/>
+            </w:tcMar>
+            <w:vAlign w:val="center"/>
+          </w:tcPr>
+          <w:p>
+            <w:pPr>
+              <w:jc w:val="left"/>
+            </w:pPr>
+            <w:r>
+              <w:rPr>
+                <w:rFonts w:ascii="Calibri" w:hAnsi="Calibri"/>
+                <w:color w:val="282828"/>
+                <w:sz w:val="19"/>
+              </w:rPr>
+              <w:t>15 MB de dependencias (solo OpenCV+NumPy)</w:t>
+            </w:r>
+          </w:p>
+        </w:tc>
+      </w:tr>
+      <w:tr>
+        <w:tc>
+          <w:tcPr>
+            <w:tcW w:type="dxa" w:w="3041"/>
+            <w:shd w:fill="FFFFFF"/>
+            <w:tcMar>
+              <w:top w:w="80" w:type="dxa"/>
+              <w:bottom w:w="80" w:type="dxa"/>
+              <w:left w:w="120" w:type="dxa"/>
+              <w:right w:w="120" w:type="dxa"/>
+            </w:tcMar>
+            <w:vAlign w:val="center"/>
+          </w:tcPr>
+          <w:p>
+            <w:pPr>
+              <w:jc w:val="center"/>
+            </w:pPr>
+            <w:r>
+              <w:rPr>
+                <w:rFonts w:ascii="Calibri" w:hAnsi="Calibri"/>
+                <w:color w:val="282828"/>
+                <w:sz w:val="19"/>
+              </w:rPr>
+              <w:t>Tiempo de Inferencia CPU</w:t>
+            </w:r>
+          </w:p>
+        </w:tc>
+        <w:tc>
+          <w:tcPr>
+            <w:tcW w:type="dxa" w:w="3041"/>
+            <w:shd w:fill="FFFFFF"/>
+            <w:tcMar>
+              <w:top w:w="80" w:type="dxa"/>
+              <w:bottom w:w="80" w:type="dxa"/>
+              <w:left w:w="120" w:type="dxa"/>
+              <w:right w:w="120" w:type="dxa"/>
+            </w:tcMar>
+            <w:vAlign w:val="center"/>
+          </w:tcPr>
+          <w:p>
+            <w:pPr>
+              <w:jc w:val="left"/>
+            </w:pPr>
+            <w:r>
+              <w:rPr>
+                <w:rFonts w:ascii="Calibri" w:hAnsi="Calibri"/>
+                <w:color w:val="282828"/>
+                <w:sz w:val="19"/>
+              </w:rPr>
+              <w:t>15 - 25 milisegundos por fotograma (30-60 FPS)</w:t>
+            </w:r>
+          </w:p>
+        </w:tc>
+        <w:tc>
+          <w:tcPr>
+            <w:tcW w:type="dxa" w:w="3041"/>
+            <w:shd w:fill="FFFFFF"/>
+            <w:tcMar>
+              <w:top w:w="80" w:type="dxa"/>
+              <w:bottom w:w="80" w:type="dxa"/>
+              <w:left w:w="120" w:type="dxa"/>
+              <w:right w:w="120" w:type="dxa"/>
+            </w:tcMar>
+            <w:vAlign w:val="center"/>
+          </w:tcPr>
+          <w:p>
+            <w:pPr>
+              <w:jc w:val="left"/>
+            </w:pPr>
+            <w:r>
+              <w:rPr>
+                <w:rFonts w:ascii="Calibri" w:hAnsi="Calibri"/>
+                <w:color w:val="282828"/>
+                <w:sz w:val="19"/>
+              </w:rPr>
+              <w:t>Fluido en cualquier laptop</w:t>
+            </w:r>
+          </w:p>
+        </w:tc>
+      </w:tr>
+      <w:tr>
+        <w:tc>
+          <w:tcPr>
+            <w:tcW w:type="dxa" w:w="3041"/>
+            <w:shd w:fill="F4F6F9"/>
+            <w:tcMar>
+              <w:top w:w="80" w:type="dxa"/>
+              <w:bottom w:w="80" w:type="dxa"/>
+              <w:left w:w="120" w:type="dxa"/>
+              <w:right w:w="120" w:type="dxa"/>
+            </w:tcMar>
+            <w:vAlign w:val="center"/>
+          </w:tcPr>
+          <w:p>
+            <w:pPr>
+              <w:jc w:val="center"/>
+            </w:pPr>
+            <w:r>
+              <w:rPr>
+                <w:rFonts w:ascii="Calibri" w:hAnsi="Calibri"/>
+                <w:color w:val="282828"/>
+                <w:sz w:val="19"/>
+              </w:rPr>
+              <w:t>Paquete Distribuible</w:t>
+            </w:r>
+          </w:p>
+        </w:tc>
+        <w:tc>
+          <w:tcPr>
+            <w:tcW w:type="dxa" w:w="3041"/>
+            <w:shd w:fill="F4F6F9"/>
+            <w:tcMar>
+              <w:top w:w="80" w:type="dxa"/>
+              <w:bottom w:w="80" w:type="dxa"/>
+              <w:left w:w="120" w:type="dxa"/>
+              <w:right w:w="120" w:type="dxa"/>
+            </w:tcMar>
+            <w:vAlign w:val="center"/>
+          </w:tcPr>
+          <w:p>
+            <w:pPr>
+              <w:jc w:val="left"/>
+            </w:pPr>
+            <w:r>
+              <w:rPr>
+                <w:rFonts w:ascii="Calibri" w:hAnsi="Calibri"/>
+                <w:color w:val="282828"/>
+                <w:sz w:val="19"/>
+              </w:rPr>
+              <w:t>Emotion_AI_Portable_v2.0.zip</w:t>
+            </w:r>
+          </w:p>
+        </w:tc>
+        <w:tc>
+          <w:tcPr>
+            <w:tcW w:type="dxa" w:w="3041"/>
+            <w:shd w:fill="F4F6F9"/>
+            <w:tcMar>
+              <w:top w:w="80" w:type="dxa"/>
+              <w:bottom w:w="80" w:type="dxa"/>
+              <w:left w:w="120" w:type="dxa"/>
+              <w:right w:w="120" w:type="dxa"/>
+            </w:tcMar>
+            <w:vAlign w:val="center"/>
+          </w:tcPr>
+          <w:p>
+            <w:pPr>
+              <w:jc w:val="left"/>
+            </w:pPr>
+            <w:r>
+              <w:rPr>
+                <w:rFonts w:ascii="Calibri" w:hAnsi="Calibri"/>
+                <w:color w:val="282828"/>
+                <w:sz w:val="19"/>
+              </w:rPr>
+              <w:t>40.5 MB listo para compartir</w:t>
+            </w:r>
+          </w:p>
+        </w:tc>
+      </w:tr>
+    </w:tbl>
+    <w:p>
+      <w:r>
+        <w:br w:type="page"/>
+      </w:r>
+    </w:p>
+    <w:p>
+      <w:pPr>
+        <w:pStyle w:val="Heading1"/>
+        <w:spacing w:before="200" w:after="80"/>
+      </w:pPr>
+      <w:r>
+        <w:rPr>
+          <w:rFonts w:ascii="Calibri" w:hAnsi="Calibri"/>
+          <w:b/>
+          <w:color w:val="003366"/>
+          <w:sz w:val="30"/>
+        </w:rPr>
+        <w:t>10. CONCLUSIONES Y RECOMENDACIONES</w:t>
       </w:r>
     </w:p>
     <w:p>
@@ -7772,7 +7072,7 @@
           <w:rFonts w:ascii="Calibri" w:hAnsi="Calibri"/>
           <w:sz w:val="22"/>
         </w:rPr>
-        <w:t>Se diseñó e implementó exitosamente una Red Neuronal Convolucional (EmotionCNN) de 4 bloques profundos, logrando una precisión superior al 55.9% en el benchmark complejo FER2013, superando ampliamente el nivel de azar aleatorio (14.28% para 7 clases).</w:t>
+        <w:t>Se diseñó e implementó exitosamente la arquitectura EmotionResNetSE (Residual Blocks + Squeeze-and-Excitation Attention), alcanzando 68.97% de Val Accuracy y 67.86% de Test Accuracy en FER2013, superando el benchmark de concordancia humana promedio (65%-68%).</w:t>
       </w:r>
     </w:p>
     <w:p>
@@ -7785,7 +7085,7 @@
           <w:rFonts w:ascii="Calibri" w:hAnsi="Calibri"/>
           <w:sz w:val="22"/>
         </w:rPr>
-        <w:t>La aceleración mediante GPU NVIDIA RTX 5060 Ti con CUDA 12.8 y PyTorch redujo drásticamente el tiempo de entrenamiento a menos de 2 minutos por época, permitiendo una rápida iteración y ajuste de hiperparámetros.</w:t>
+        <w:t>El uso de Ponderación de Clases (Class Weights) y Label Smoothing incrementó drásticamente el Recall en clases críticas y desbalanceadas, elevando 'Disgusto' a 67.57% (frente a 47.75% anterior) y 'Miedo' a 48.54% (frente a 31.93%).</w:t>
       </w:r>
     </w:p>
     <w:p>
@@ -7798,7 +7098,7 @@
           <w:rFonts w:ascii="Calibri" w:hAnsi="Calibri"/>
           <w:sz w:val="22"/>
         </w:rPr>
-        <w:t>Las técnicas de regularización implementadas (Batch Normalization, Dropout al 25% y 50%, y Data Augmentation) resultaron determinantes para estabilizar la convergencia y evitar el sobreajuste severo en una red de 2.48 millones de parámetros.</w:t>
+        <w:t>La estrategia de carga y Data Augmentation 100% residente en VRAM (78.9 MB) eliminó los cuellos de botella de memoria RAM y transferencias PCIe, acelerando el entrenamiento a solo 12 segundos por época en la GPU NVIDIA RTX 5060 Ti.</w:t>
       </w:r>
     </w:p>
     <w:p>
@@ -7811,7 +7111,7 @@
           <w:rFonts w:ascii="Calibri" w:hAnsi="Calibri"/>
           <w:sz w:val="22"/>
         </w:rPr>
-        <w:t>El análisis por emoción demostró un rendimiento sobresaliente en clases con gestos morfológicos distintivos como 'Feliz' (Recall 88.7%, Precision 71.2%) y 'Sorprendido' (Recall 74.9%), mientras que emociones como 'Disgusto' presentan un área de oportunidad clara debido al desbalance muestral del dataset.</w:t>
+        <w:t>La integración del detector neuronal YuNet ONNX erradicó la pérdida de seguimiento facial al girar la cabeza de perfil (yaw ±90°) y eliminó falsos positivos sobre fondos y vestimenta.</w:t>
       </w:r>
     </w:p>
     <w:p>
@@ -7824,7 +7124,20 @@
           <w:rFonts w:ascii="Calibri" w:hAnsi="Calibri"/>
           <w:sz w:val="22"/>
         </w:rPr>
-        <w:t>La integración en tiempo real con OpenCV demostró latencias de inferencia inferiores a 10 ms por cuadro, confirmando la viabilidad del modelo para su despliegue en sistemas interactivos de visión artificial.</w:t>
+        <w:t>El mecanismo de Suavizado Temporal EMA (alfa=0.30) estabilizó la salida en streaming de webcam, transformando la experiencia de usuario en un sistema fluido, profesional y libre de parpadeos.</w:t>
+      </w:r>
+    </w:p>
+    <w:p>
+      <w:pPr>
+        <w:pStyle w:val="ListBullet"/>
+        <w:spacing w:after="120"/>
+      </w:pPr>
+      <w:r>
+        <w:rPr>
+          <w:rFonts w:ascii="Calibri" w:hAnsi="Calibri"/>
+          <w:sz w:val="22"/>
+        </w:rPr>
+        <w:t>La exportación a formato universal ONNX y la creación del paquete portátil autónomo (.ZIP con lanzador .bat) demostraron la viabilidad de transferir modelos de Deep Learning de última generación a cualquier computadora convencional con solo 15 MB de dependencias y sin pérdida de precisión.</w:t>
       </w:r>
     </w:p>
     <w:p>
@@ -7844,7 +7157,7 @@
           <w:color w:val="003366"/>
           <w:sz w:val="30"/>
         </w:rPr>
-        <w:t>10. REFERENCIAS BIBLIOGRÁFICAS</w:t>
+        <w:t>11. REFERENCIAS BIBLIOGRÁFICAS</w:t>
       </w:r>
     </w:p>
     <w:p>
@@ -7857,7 +7170,7 @@
           <w:rFonts w:ascii="Calibri" w:hAnsi="Calibri"/>
           <w:sz w:val="20"/>
         </w:rPr>
-        <w:t>[1]  Goodfellow, I., Bengio, Y., &amp; Courville, A. (2016). "Deep Learning". MIT Press.</w:t>
+        <w:t>[1]  He, K., Zhang, X., Ren, S., &amp; Sun, J. (2016). "Deep Residual Learning for Image Recognition". IEEE CVPR, pp. 770-778.</w:t>
       </w:r>
     </w:p>
     <w:p>
@@ -7870,7 +7183,7 @@
           <w:rFonts w:ascii="Calibri" w:hAnsi="Calibri"/>
           <w:sz w:val="20"/>
         </w:rPr>
-        <w:t>[2]  Goodfellow, I. J., et al. (2013). "Challenges in Representation Learning: A report on three machine learning contests". ICML Workshop on Challenges in Representation Learning.</w:t>
+        <w:t>[2]  Hu, J., Shen, L., &amp; Sun, G. (2018). "Squeeze-and-Excitation Networks". IEEE CVPR, pp. 7132-7141.</w:t>
       </w:r>
     </w:p>
     <w:p>
@@ -7883,7 +7196,7 @@
           <w:rFonts w:ascii="Calibri" w:hAnsi="Calibri"/>
           <w:sz w:val="20"/>
         </w:rPr>
-        <w:t>[3]  LeCun, Y., Bengio, Y., &amp; Hinton, G. (2015). "Deep learning". Nature, 521(7553), 436-444.</w:t>
+        <w:t>[3]  Bai, J., et al. (2019). "ONNX: Open Neural Network Exchange". GitHub repository, https://github.com/onnx/onnx.</w:t>
       </w:r>
     </w:p>
     <w:p>
@@ -7896,7 +7209,7 @@
           <w:rFonts w:ascii="Calibri" w:hAnsi="Calibri"/>
           <w:sz w:val="20"/>
         </w:rPr>
-        <w:t>[4]  He, K., Zhang, X., Ren, S., &amp; Sun, J. (2016). "Deep Residual Learning for Image Recognition". IEEE CVPR.</w:t>
+        <w:t>[4]  Goodfellow, I. J., et al. (2013). "Challenges in Representation Learning: A report on three machine learning contests". ICML Workshop on Representation Learning (FER-2013).</w:t>
       </w:r>
     </w:p>
     <w:p>
@@ -7909,7 +7222,7 @@
           <w:rFonts w:ascii="Calibri" w:hAnsi="Calibri"/>
           <w:sz w:val="20"/>
         </w:rPr>
-        <w:t>[5]  Ioffe, S., &amp; Szegedy, C. (2015). "Batch Normalization: Accelerating Deep Network Training by Reducing Internal Covariate Shift". ICML.</w:t>
+        <w:t>[5]  Goodfellow, I., Bengio, Y., &amp; Courville, A. (2016). "Deep Learning". MIT Press.</w:t>
       </w:r>
     </w:p>
     <w:p>
@@ -7922,7 +7235,7 @@
           <w:rFonts w:ascii="Calibri" w:hAnsi="Calibri"/>
           <w:sz w:val="20"/>
         </w:rPr>
-        <w:t>[6]  Srivastava, N., et al. (2014). "Dropout: A Simple Way to Prevent Neural Networks from Overfitting". JMLR, 15(1), 1929-1958.</w:t>
+        <w:t>[6]  Muller, R., Kornblith, S., &amp; Hinton, G. E. (2019). "When Does Label Smoothing Help?". Advances in Neural Information Processing Systems (NeurIPS), 32.</w:t>
       </w:r>
     </w:p>
     <w:p>
@@ -7935,7 +7248,7 @@
           <w:rFonts w:ascii="Calibri" w:hAnsi="Calibri"/>
           <w:sz w:val="20"/>
         </w:rPr>
-        <w:t>[7]  Paszke, A., et al. (2019). "PyTorch: An Imperative Style, High-Performance Deep Learning Library". NeurIPS.</w:t>
+        <w:t>[7]  Loshchilov, I., &amp; Hutter, F. (2019). "Decoupled Weight Decay Regularization (AdamW)". ICLR.</w:t>
       </w:r>
     </w:p>
     <w:p>
@@ -7948,7 +7261,33 @@
           <w:rFonts w:ascii="Calibri" w:hAnsi="Calibri"/>
           <w:sz w:val="20"/>
         </w:rPr>
-        <w:t>[8]  Bradski, G. (2000). "The OpenCV Library". Dr. Dobb's Journal of Software Tools.</w:t>
+        <w:t>[8]  Zhang, S., Zhu, X., Lei, Z., Shi, H., Wang, X., &amp; Li, S. Z. (2020). "FaceBoxes: A Rapid yet High-Accuracy Face Detector". IEEE Transactions on Biometrics (YuNet Base).</w:t>
+      </w:r>
+    </w:p>
+    <w:p>
+      <w:pPr>
+        <w:spacing w:after="100"/>
+        <w:ind w:left="454" w:hanging="454"/>
+      </w:pPr>
+      <w:r>
+        <w:rPr>
+          <w:rFonts w:ascii="Calibri" w:hAnsi="Calibri"/>
+          <w:sz w:val="20"/>
+        </w:rPr>
+        <w:t>[9]  Bradski, G. (2000). "The OpenCV Library / Deep Neural Network Module (DNN)". Dr. Dobb's Journal of Software Tools.</w:t>
+      </w:r>
+    </w:p>
+    <w:p>
+      <w:pPr>
+        <w:spacing w:after="100"/>
+        <w:ind w:left="454" w:hanging="454"/>
+      </w:pPr>
+      <w:r>
+        <w:rPr>
+          <w:rFonts w:ascii="Calibri" w:hAnsi="Calibri"/>
+          <w:sz w:val="20"/>
+        </w:rPr>
+        <w:t>[10]  Paszke, A., et al. (2019). "PyTorch: An Imperative Style, High-Performance Deep Learning Library". NeurIPS.</w:t>
       </w:r>
     </w:p>
     <w:sectPr>

</xml_diff>